<commit_message>
docs: v43 editada pelo autor e rodada v45 - operador ligado ao diagnostico no diagrama de casos de uso
Co-Authored-By: Claude Opus 5.5 <noreply@anthropic.com>
</commit_message>
<xml_diff>
--- a/Transicao_pre-projeto-para-TCC-Completo_TCC_Iluminacao_SP_v43.docx
+++ b/Transicao_pre-projeto-para-TCC-Completo_TCC_Iluminacao_SP_v43.docx
@@ -320,6 +320,7 @@
         <w:rPr>
           <w:lang w:val="pt-BR"/>
         </w:rPr>
+        <w:lastRenderedPageBreak/>
         <w:t>BRUNO BONAVIGO DACAL – N309EC4</w:t>
       </w:r>
     </w:p>
@@ -594,6 +595,7 @@
           <w:bCs/>
           <w:lang w:val="pt-BR"/>
         </w:rPr>
+        <w:lastRenderedPageBreak/>
         <w:t>RESUMO</w:t>
       </w:r>
     </w:p>
@@ -665,6 +667,7 @@
           <w:bCs/>
           <w:lang w:val="pt-BR"/>
         </w:rPr>
+        <w:lastRenderedPageBreak/>
         <w:t>ABSTRACT</w:t>
       </w:r>
     </w:p>
@@ -721,6 +724,7 @@
           <w:bCs/>
           <w:lang w:val="pt-BR"/>
         </w:rPr>
+        <w:lastRenderedPageBreak/>
         <w:t>LISTA DE QUADROS</w:t>
       </w:r>
     </w:p>
@@ -1205,6 +1209,7 @@
           <w:bCs/>
           <w:lang w:val="pt-BR"/>
         </w:rPr>
+        <w:lastRenderedPageBreak/>
         <w:t>LISTA DE FIGURAS</w:t>
       </w:r>
     </w:p>
@@ -1253,7 +1258,7 @@
         <w:rPr>
           <w:lang w:val="pt-BR"/>
         </w:rPr>
-        <w:t xml:space="preserve">Figura 3 – Diagrama de casos de uso</w:t>
+        <w:t>Figura 3 – Diagrama de casos de uso</w:t>
       </w:r>
     </w:p>
     <w:p>
@@ -1270,13 +1275,7 @@
         <w:rPr>
           <w:lang w:val="pt-BR"/>
         </w:rPr>
-        <w:t xml:space="preserve">Figura 4</w:t>
-      </w:r>
-      <w:r>
-        <w:rPr>
-          <w:lang w:val="pt-BR"/>
-        </w:rPr>
-        <w:t xml:space="preserve"> – Arquitetura do sistema</w:t>
+        <w:t>Figura 4 – Arquitetura do sistema</w:t>
       </w:r>
       <w:r>
         <w:rPr>
@@ -1300,13 +1299,7 @@
         <w:rPr>
           <w:lang w:val="pt-BR"/>
         </w:rPr>
-        <w:t xml:space="preserve">Figura 5</w:t>
-      </w:r>
-      <w:r>
-        <w:rPr>
-          <w:lang w:val="pt-BR"/>
-        </w:rPr>
-        <w:t xml:space="preserve"> – Sequência de mensagens de uma decisão</w:t>
+        <w:t>Figura 5 – Sequência de mensagens de uma decisão</w:t>
       </w:r>
     </w:p>
     <w:p>
@@ -1323,13 +1316,7 @@
         <w:rPr>
           <w:lang w:val="pt-BR"/>
         </w:rPr>
-        <w:t xml:space="preserve">Figura 6</w:t>
-      </w:r>
-      <w:r>
-        <w:rPr>
-          <w:lang w:val="pt-BR"/>
-        </w:rPr>
-        <w:t xml:space="preserve"> – Painel de acompanhamento: visão de monitoramento</w:t>
+        <w:t>Figura 6 – Painel de acompanhamento: visão de monitoramento</w:t>
       </w:r>
     </w:p>
     <w:p>
@@ -1346,13 +1333,7 @@
         <w:rPr>
           <w:lang w:val="pt-BR"/>
         </w:rPr>
-        <w:t xml:space="preserve">Figura 7</w:t>
-      </w:r>
-      <w:r>
-        <w:rPr>
-          <w:lang w:val="pt-BR"/>
-        </w:rPr>
-        <w:t xml:space="preserve"> – Painel de acompanhamento: decisão explicada regra a regra</w:t>
+        <w:t>Figura 7 – Painel de acompanhamento: decisão explicada regra a regra</w:t>
       </w:r>
     </w:p>
     <w:p>
@@ -1366,13 +1347,7 @@
         <w:rPr>
           <w:lang w:val="pt-BR"/>
         </w:rPr>
-        <w:t xml:space="preserve">Figura 8</w:t>
-      </w:r>
-      <w:r>
-        <w:rPr>
-          <w:lang w:val="pt-BR"/>
-        </w:rPr>
-        <w:t xml:space="preserve"> – Painel de acompanhamento: consumo estimado</w:t>
+        <w:t>Figura 8 – Painel de acompanhamento: consumo estimado</w:t>
       </w:r>
     </w:p>
     <w:p>
@@ -1386,13 +1361,7 @@
         <w:rPr>
           <w:lang w:val="pt-BR"/>
         </w:rPr>
-        <w:t xml:space="preserve">Figura 9</w:t>
-      </w:r>
-      <w:r>
-        <w:rPr>
-          <w:lang w:val="pt-BR"/>
-        </w:rPr>
-        <w:t xml:space="preserve"> – Painel de acompanhamento: registro de decisões, diagnóstico e publicações</w:t>
+        <w:t>Figura 9 – Painel de acompanhamento: registro de decisões, diagnóstico e publicações</w:t>
       </w:r>
     </w:p>
     <w:p>
@@ -1409,13 +1378,7 @@
         <w:rPr>
           <w:lang w:val="pt-BR"/>
         </w:rPr>
-        <w:t xml:space="preserve">Figura 10</w:t>
-      </w:r>
-      <w:r>
-        <w:rPr>
-          <w:lang w:val="pt-BR"/>
-        </w:rPr>
-        <w:t xml:space="preserve"> – Diagrama entidade-relacionamento do banco de dados</w:t>
+        <w:t>Figura 10 – Diagrama entidade-relacionamento do banco de dados</w:t>
       </w:r>
       <w:r>
         <w:rPr>
@@ -1439,13 +1402,7 @@
         <w:rPr>
           <w:lang w:val="pt-BR"/>
         </w:rPr>
-        <w:t xml:space="preserve">Figura 11</w:t>
-      </w:r>
-      <w:r>
-        <w:rPr>
-          <w:lang w:val="pt-BR"/>
-        </w:rPr>
-        <w:t xml:space="preserve"> – Vista posterior do nó de demonstração</w:t>
+        <w:t>Figura 11 – Vista posterior do nó de demonstração</w:t>
       </w:r>
     </w:p>
     <w:p>
@@ -1475,6 +1432,7 @@
           <w:bCs/>
           <w:lang w:val="pt-BR"/>
         </w:rPr>
+        <w:lastRenderedPageBreak/>
         <w:t>LISTA DE TABELAS</w:t>
       </w:r>
     </w:p>
@@ -7274,6 +7232,7 @@
         <w:rPr>
           <w:lang w:val="pt-BR"/>
         </w:rPr>
+        <w:lastRenderedPageBreak/>
         <w:t>1 INTRODUÇÃO</w:t>
       </w:r>
       <w:bookmarkEnd w:id="0"/>
@@ -7422,6 +7381,7 @@
         <w:rPr>
           <w:lang w:val="pt-BR"/>
         </w:rPr>
+        <w:lastRenderedPageBreak/>
         <w:t>O estágio atual dessas iniciativas em São Paulo tem um traço que interessa diretamente a este trabalho: a instrumentação da cidade deixou de ser proposta e passou a ser infraestrutura instalada e contratada. Não se trata, portanto, de propor que a cidade passe a coletar dados ou a controlar remotamente suas luminárias — ambas as coisas já estão contratadas. Trata-se de propor um uso para o que já existe.</w:t>
       </w:r>
     </w:p>
@@ -7542,6 +7502,7 @@
         <w:rPr>
           <w:lang w:val="pt-BR"/>
         </w:rPr>
+        <w:lastRenderedPageBreak/>
         <w:t>incide sobre um fenômeno mensurável, e não sobre o julgamento de qual seria o nível correto de iluminação — julgamento que não dispõe de referência externa e cuja rotulação pelos próprios autores tornaria a avaliação circular.</w:t>
       </w:r>
     </w:p>
@@ -7656,6 +7617,7 @@
         <w:rPr>
           <w:lang w:val="pt-BR"/>
         </w:rPr>
+        <w:lastRenderedPageBreak/>
         <w:t>A iluminação pública não se adapta às variações das condições e da movimentação urbana. Operada em fluxo pleno durante toda a noite, oferece iluminação desnecessariamente elevada em situações de menor demanda. Atenuada por horário fixo, a forma mais simples de reduzir o consumo, pode oferecer iluminação insuficiente quando a via continua ocupada ou quando ocorre um evento que exigiria mais luz.</w:t>
       </w:r>
     </w:p>
@@ -7794,6 +7756,7 @@
         <w:rPr>
           <w:lang w:val="pt-BR"/>
         </w:rPr>
+        <w:lastRenderedPageBreak/>
         <w:t>intensidade de um nó de iluminação pública de forma consistente com as condições observadas, dentro de limite de latência especificado, e sem violar em nenhuma decisão os limites estabelecidos pela ABNT NBR 5101.</w:t>
       </w:r>
     </w:p>
@@ -7991,6 +7954,7 @@
         <w:rPr>
           <w:lang w:val="pt-BR"/>
         </w:rPr>
+        <w:lastRenderedPageBreak/>
         <w:t>Estimar o consumo de energia sob o regime adaptativo — no nó de bancada, a partir da trajetória de ciclo de trabalho registrada, e em luminária de referência derivada dos parâmetros contratuais do parque municipal, a partir do registro de decisões — e compará-lo ao do regime de fluxo pleno constante e ao de um regime de atenuação por horário fixo, sobre a mesma suíte de cenários.</w:t>
       </w:r>
     </w:p>
@@ -8094,6 +8058,7 @@
         <w:rPr>
           <w:lang w:val="pt-BR"/>
         </w:rPr>
+        <w:lastRenderedPageBreak/>
         <w:t>conflito, e precisam ser compostas numa saída única. O trabalho implementa essa composição por inferência nebulosa e a confronta com uma tabela de decisão com as mesmas regras (4.6).</w:t>
       </w:r>
     </w:p>
@@ -8175,6 +8140,7 @@
         <w:rPr>
           <w:lang w:val="pt-BR"/>
         </w:rPr>
+        <w:lastRenderedPageBreak/>
         <w:t>Quanto à forma de execução, o trabalho combina pesquisa documental sobre a infraestrutura instalada e sobre os dados abertos municipais, desenvolvimento de protótipo e experimentação em bancada, nos termos de 3.1. O método está descrito no Capítulo 3, e a documentação de engenharia de software que orienta a implementação e o banco de dados, ao final dele, em 3.12 e 3.13.</w:t>
       </w:r>
     </w:p>
@@ -8192,6 +8158,7 @@
         <w:rPr>
           <w:lang w:val="pt-BR"/>
         </w:rPr>
+        <w:lastRenderedPageBreak/>
         <w:t>2 REVISÃO BIBLIOGRÁFICA</w:t>
       </w:r>
       <w:bookmarkEnd w:id="13"/>
@@ -8296,6 +8263,7 @@
         <w:rPr>
           <w:lang w:val="pt-BR"/>
         </w:rPr>
+        <w:lastRenderedPageBreak/>
         <w:t>de publicação, e sim pela vigência, e a edição citada é a que permanece em vigor. Dela não se extrai afirmação sobre o estado da arte da técnica. Fica também fora do recorte o estudo de Shikakura, Morikawa e Nakamura (2003), empregado em 3.9 por ser a fonte localizada pelos autores com valor medido de limiar de percepção de variação de iluminância; dele se extrai apenas esse valor. Normas e especificações técnicas — da ABNT, da ISO/IEC, da ANSI, da OASIS e do consórcio TALQ — e a folha de dados do fabricante do microcontrolador comparecem como fonte do que especificam; os documentos da associação setorial de concessionárias, como fonte de dados do setor; e o relato jornalístico de Perry (2020), apenas como registro do caso descrito em 3.10. De nenhuma dessas fontes se extrai afirmação de desempenho.</w:t>
       </w:r>
     </w:p>
@@ -8377,6 +8345,7 @@
         <w:rPr>
           <w:lang w:val="pt-BR"/>
         </w:rPr>
+        <w:lastRenderedPageBreak/>
         <w:t>Anthony Jnr (2024) conduz revisão sistemática sobre o emprego de interfaces de programação de aplicações na interoperabilidade entre sistemas digitais municipais e aponta os sistemas isolados, sem padronização de interfaces, como obstáculo à integração, e a especificação da interface como o instrumento pelo qual esse isolamento se resolve.</w:t>
       </w:r>
     </w:p>
@@ -8441,6 +8410,7 @@
         <w:rPr>
           <w:lang w:val="pt-BR"/>
         </w:rPr>
+        <w:lastRenderedPageBreak/>
         <w:t>2.3 A infraestrutura instalada no município de São Paulo</w:t>
       </w:r>
       <w:bookmarkEnd w:id="16"/>
@@ -8965,6 +8935,7 @@
                 <w:szCs w:val="20"/>
                 <w:lang w:val="pt-BR"/>
               </w:rPr>
+              <w:lastRenderedPageBreak/>
               <w:t>substituindo o tempo presumido pela medição</w:t>
             </w:r>
           </w:p>
@@ -8991,6 +8962,7 @@
                 <w:szCs w:val="20"/>
                 <w:lang w:val="pt-BR"/>
               </w:rPr>
+              <w:lastRenderedPageBreak/>
               <w:t>Nenhum ato vincula a operação da iluminação a dados de outras plataformas municipais</w:t>
             </w:r>
           </w:p>
@@ -9163,6 +9135,7 @@
         <w:rPr>
           <w:lang w:val="pt-BR"/>
         </w:rPr>
+        <w:lastRenderedPageBreak/>
         <w:t>já é produzido — o que desloca a integração do terreno do desenvolvimento para o da especificação de interface.</w:t>
       </w:r>
     </w:p>
@@ -9259,6 +9232,7 @@
         <w:rPr>
           <w:lang w:val="pt-BR"/>
         </w:rPr>
+        <w:lastRenderedPageBreak/>
         <w:t>2.4 Internet das Coisas e nós embarcados</w:t>
       </w:r>
       <w:bookmarkEnd w:id="17"/>
@@ -9340,6 +9314,7 @@
         <w:rPr>
           <w:lang w:val="pt-BR"/>
         </w:rPr>
+        <w:lastRenderedPageBreak/>
         <w:t>2.5 Requisitos normativos</w:t>
       </w:r>
       <w:bookmarkEnd w:id="18"/>
@@ -9427,6 +9402,7 @@
         <w:rPr>
           <w:lang w:val="pt-BR"/>
         </w:rPr>
+        <w:lastRenderedPageBreak/>
         <w:t>iluminação adaptativa. O emprego de dados do ambiente urbano como entrada da decisão segue, portanto, essa recomendação.</w:t>
       </w:r>
     </w:p>
@@ -9514,6 +9490,7 @@
         <w:rPr>
           <w:lang w:val="pt-BR"/>
         </w:rPr>
+        <w:lastRenderedPageBreak/>
         <w:t>representação sintetiza controladores a partir de conhecimento expresso em linguagem natural, dispensando modelo matemático do processo controlado. Estas duas obras comparecem como atribuição de origem, nos termos da subseção 2.1.</w:t>
       </w:r>
     </w:p>
@@ -9584,6 +9561,7 @@
         <w:rPr>
           <w:lang w:val="pt-BR"/>
         </w:rPr>
+        <w:lastRenderedPageBreak/>
         <w:t>de ser produzidos pelos próprios autores, o que introduziria circularidade: o sistema aprenderia a reproduzir o julgamento de quem o avalia. A inferência nebulosa, derivando suas regras da norma técnica e de critérios de projeto declarados, mantém a base de decisão auditável e livre dessa circularidade.</w:t>
       </w:r>
     </w:p>
@@ -9655,6 +9633,7 @@
         <w:rPr>
           <w:lang w:val="pt-BR"/>
         </w:rPr>
+        <w:lastRenderedPageBreak/>
         <w:t>modelos de árvores entre si; essa comparação foi feita sobre os próprios dados do trabalho (3.6 e 4.1).</w:t>
       </w:r>
     </w:p>
@@ -9758,6 +9737,7 @@
         <w:rPr>
           <w:lang w:val="pt-BR"/>
         </w:rPr>
+        <w:lastRenderedPageBreak/>
         <w:t>da iluminação urbana como problema de otimização distribuída de restrições e o resolve por algoritmos executados em rede de luminárias, com cada ponto negociando seu nível com os vizinhos a partir de variáveis ambientais. A proximidade de finalidade é grande e a diferença é de premissa. Naquele trabalho, cada poste dispõe de sensoriamento local, e a avaliação é conduzida em ambiente simulado: a camada de percepção é uma infraestrutura a implantar. Aqui, a percepção é uma infraestrutura já contratada e em operação, produzida por outro sistema municipal para outra finalidade, e o problema desloca-se do sensoriamento para a integração e a decisão.</w:t>
       </w:r>
     </w:p>
@@ -9806,6 +9786,7 @@
         <w:rPr>
           <w:lang w:val="pt-BR"/>
         </w:rPr>
+        <w:lastRenderedPageBreak/>
         <w:t>No plano das implantações, a referência é a rua Stratumseind, em Eindhoven, onde dados de câmeras e de sensores acústicos alimentaram perfis que acionavam cenários dinâmicos de iluminação (GALIC; GELLERT, 2021). Este último é o precedente mais próximo de um laço fechado entre plataforma urbana e iluminação, e três diferenças o separam desta proposta: sua finalidade é comportamental, e não fotométrica; a decisão não é confrontada com classe de iluminação alguma; e a literatura revisada por pares que o documenta é de proteção de dados, e não de arquitetura de sistemas — é precisamente a ausência de garantias que ela critica.</w:t>
       </w:r>
     </w:p>
@@ -9925,6 +9906,7 @@
         <w:rPr>
           <w:lang w:val="pt-BR"/>
         </w:rPr>
+        <w:lastRenderedPageBreak/>
         <w:t>mecanismo, e a interface que o integraria à infraestrutura existente, que o trabalho constrói e avalia.</w:t>
       </w:r>
     </w:p>
@@ -10052,6 +10034,7 @@
         <w:rPr>
           <w:lang w:val="pt-BR"/>
         </w:rPr>
+        <w:lastRenderedPageBreak/>
         <w:t>reduzindo a fração da janela de baixa demanda consumida em transição quando comparada ao acionamento puramente reativo.</w:t>
       </w:r>
     </w:p>
@@ -10069,6 +10052,7 @@
         <w:rPr>
           <w:lang w:val="pt-BR"/>
         </w:rPr>
+        <w:lastRenderedPageBreak/>
         <w:t>3 METODOLOGIA</w:t>
       </w:r>
       <w:bookmarkEnd w:id="24"/>
@@ -10252,6 +10236,7 @@
         <w:rPr>
           <w:lang w:val="pt-BR"/>
         </w:rPr>
+        <w:lastRenderedPageBreak/>
         <w:t>Camada de verificação normativa. Interposta entre a decisão e a atuação, confronta o nível pretendido com o piso extraído da ABNT NBR 5101 e corrige a decisão antes de emiti-la, registrando a correção; a taxa máxima de decréscimo segue com o comando e é aplicada pelo nó (3.7).</w:t>
       </w:r>
     </w:p>
@@ -10352,6 +10337,7 @@
         <w:rPr>
           <w:lang w:val="pt-BR"/>
         </w:rPr>
+        <w:lastRenderedPageBreak/>
         <w:t>A terceira é de governança. Anthony Jnr (2024) aponta os sistemas isolados como obstáculo à integração e identifica na especificação da interface o instrumento pelo qual esse isolamento se resolve. Alojar a lógica de iluminação no contrato de uma plataforma de segurança produziria mais um sistema desse tipo. Acresce que a camada de verificação normativa, para permanecer auditável, precisa ser inspecionável por quem responde pela iluminação pública, condição que não se satisfaz dentro de sistema operado por terceiro sob outro contrato.</w:t>
       </w:r>
     </w:p>
@@ -10368,19 +10354,7 @@
         <w:rPr>
           <w:lang w:val="pt-BR"/>
         </w:rPr>
-        <w:t xml:space="preserve">O serviço de decisão é, por isso, especificado como serviço municipal autônomo: não pertence à plataforma de monitoramento nem ao sistema de telegestão, consome a interface da primeira e comanda o segundo. É essa a posição que a </w:t>
-      </w:r>
-      <w:r>
-        <w:rPr>
-          <w:lang w:val="pt-BR"/>
-        </w:rPr>
-        <w:t xml:space="preserve">Figura 4</w:t>
-      </w:r>
-      <w:r>
-        <w:rPr>
-          <w:lang w:val="pt-BR"/>
-        </w:rPr>
-        <w:t xml:space="preserve"> representa e que a documentação de 3.12 detalha.</w:t>
+        <w:t>O serviço de decisão é, por isso, especificado como serviço municipal autônomo: não pertence à plataforma de monitoramento nem ao sistema de telegestão, consome a interface da primeira e comanda o segundo. É essa a posição que a Figura 4 representa e que a documentação de 3.12 detalha.</w:t>
       </w:r>
     </w:p>
     <w:p>
@@ -11168,6 +11142,7 @@
                 <w:szCs w:val="20"/>
                 <w:lang w:val="pt-BR"/>
               </w:rPr>
+              <w:lastRenderedPageBreak/>
               <w:t>Segmento de fita de LED e módulo de acionamento</w:t>
             </w:r>
           </w:p>
@@ -11592,6 +11567,7 @@
         <w:rPr>
           <w:lang w:val="pt-BR"/>
         </w:rPr>
+        <w:lastRenderedPageBreak/>
         <w:t>tabela de calibração levantada por medição, com interpolação linear entre pontos medidos; no parque, por controlador em tomada normalizada acionando o driver por controle analógico de 0 V a 10 V, com a iluminância resultante conhecida da certificação do produto. Mesma entrada, atuador diferente. É por isso que o que a bancada estabelece a respeito da decisão transpõe-se ao parque sem depender de que o equipamento seja o mesmo.</w:t>
       </w:r>
     </w:p>
@@ -12829,6 +12805,7 @@
                 <w:szCs w:val="20"/>
                 <w:lang w:val="pt-BR"/>
               </w:rPr>
+              <w:lastRenderedPageBreak/>
               <w:t>de 2019, e consolidada em 2022</w:t>
             </w:r>
           </w:p>
@@ -12857,6 +12834,7 @@
                 <w:szCs w:val="20"/>
                 <w:lang w:val="pt-BR"/>
               </w:rPr>
+              <w:lastRenderedPageBreak/>
               <w:t>Verificação da execução e diagnóstico do ativo</w:t>
             </w:r>
           </w:p>
@@ -13002,6 +12980,7 @@
         <w:rPr>
           <w:lang w:val="pt-BR"/>
         </w:rPr>
+        <w:lastRenderedPageBreak/>
         <w:t>3.4 O nó de demonstração</w:t>
       </w:r>
       <w:bookmarkEnd w:id="28"/>
@@ -13751,6 +13730,7 @@
           <w:szCs w:val="20"/>
           <w:lang w:val="pt-BR"/>
         </w:rPr>
+        <w:lastRenderedPageBreak/>
         <w:t>Figura 1 – Nó de demonstração montado</w:t>
       </w:r>
     </w:p>
@@ -13856,6 +13836,7 @@
         <w:rPr>
           <w:lang w:val="pt-BR"/>
         </w:rPr>
+        <w:lastRenderedPageBreak/>
         <w:t>RNF07; a validade acompanha a do volume que sustenta a decisão, de no máximo 15 min (3.5.2). Por fim, a configuração de rede e a credencial do dispositivo residem em arquivo próprio do nó, mantido fora do repositório de código.</w:t>
       </w:r>
     </w:p>
@@ -14432,6 +14413,7 @@
                 <w:szCs w:val="20"/>
                 <w:lang w:val="pt-BR"/>
               </w:rPr>
+              <w:lastRenderedPageBreak/>
               <w:t>incandescente com dimerizador</w:t>
             </w:r>
           </w:p>
@@ -14458,6 +14440,7 @@
                 <w:szCs w:val="20"/>
                 <w:lang w:val="pt-BR"/>
               </w:rPr>
+              <w:lastRenderedPageBreak/>
               <w:t xml:space="preserve">A fita traz resistores de limitação integrados, o que elimina o cálculo e a dissipação do lastro, dispensa base metálica e reduz a montagem a dois condutores. A objeção usual à fita — a de ser fonte extensa — aplica-se ao rolo, não ao segmento: seis centímetros a 0,44 m subtendem cerca de oito graus, a uma distância superior a sete vezes o comprimento da fonte, e comportam-se </w:t>
             </w:r>
             <w:r>
@@ -14466,6 +14449,7 @@
                 <w:szCs w:val="20"/>
                 <w:lang w:val="pt-BR"/>
               </w:rPr>
+              <w:lastRenderedPageBreak/>
               <w:t>como fonte pontual para efeito do cálculo. O refletor de 12 V e a luminária viária têm fluxo muito superior ao necessário para obter 10 lux a menos de meio metro. A lâmpada incandescente não representa a tecnologia instalada no município</w:t>
             </w:r>
           </w:p>
@@ -14489,6 +14473,7 @@
                 <w:sz w:val="20"/>
                 <w:szCs w:val="20"/>
               </w:rPr>
+              <w:lastRenderedPageBreak/>
               <w:t>Medição</w:t>
             </w:r>
             <w:proofErr w:type="spellEnd"/>
@@ -14753,6 +14738,7 @@
         <w:rPr>
           <w:lang w:val="pt-BR"/>
         </w:rPr>
+        <w:lastRenderedPageBreak/>
         <w:t>interface elétrica e não de natureza do comando: a camada de decisão emite um nível adimensional, e é o nó que o materializa segundo a interface disponível. Registrar isso é o que permite afirmar que o mecanismo demonstrado é transponível ao equipamento efetivamente instalado.</w:t>
       </w:r>
     </w:p>
@@ -14860,6 +14846,7 @@
         <w:rPr>
           <w:lang w:val="pt-BR"/>
         </w:rPr>
+        <w:lastRenderedPageBreak/>
         <w:t>Foi o que ocorreu na bancada: na primeira montagem, três emissores a 0,44 m produziram 42,6 lux sem difusor, mais de quatro vezes o valor da classe. Na caixa atual, que substituiu a primeira em 10 de outubro de 2026, a primeira leitura com o difusor deu 2,05 vezes o valor da classe; ajustado o difusor, a leitura a ciclo de trabalho pleno ficou em 1,57 vez.</w:t>
       </w:r>
     </w:p>
@@ -15229,6 +15216,7 @@
                 <w:sz w:val="20"/>
                 <w:szCs w:val="20"/>
               </w:rPr>
+              <w:lastRenderedPageBreak/>
               <w:t>Iluminação</w:t>
             </w:r>
             <w:proofErr w:type="spellEnd"/>
@@ -15657,7 +15645,6 @@
           </w:tcPr>
           <w:p>
             <w:proofErr w:type="spellStart"/>
-            <w:proofErr w:type="gramStart"/>
             <w:r>
               <w:rPr>
                 <w:sz w:val="20"/>
@@ -15666,7 +15653,6 @@
               <w:t>Não</w:t>
             </w:r>
             <w:proofErr w:type="spellEnd"/>
-            <w:proofErr w:type="gramEnd"/>
             <w:r>
               <w:rPr>
                 <w:sz w:val="20"/>
@@ -15800,6 +15786,7 @@
           <w:szCs w:val="20"/>
           <w:lang w:val="pt-BR"/>
         </w:rPr>
+        <w:lastRenderedPageBreak/>
         <w:t>Figura 2 – Interior do anteparo: luminária em uma extremidade e sensor na outra</w:t>
       </w:r>
     </w:p>
@@ -15932,6 +15919,7 @@
         <w:rPr>
           <w:lang w:val="pt-BR"/>
         </w:rPr>
+        <w:lastRenderedPageBreak/>
         <w:t>A exatidão absoluta do sensor adotado não é verificada, e a bancada não dispõe de instrumento de referência calibrado contra padrão metrológico. Essa é a limitação de medição do arranjo, e convém delimitar com precisão o que ela afeta e o que não afeta.</w:t>
       </w:r>
     </w:p>
@@ -16002,6 +15990,7 @@
         <w:rPr>
           <w:lang w:val="pt-BR"/>
         </w:rPr>
+        <w:lastRenderedPageBreak/>
         <w:t>em 3.4.3. Nenhuma delas se confunde com a verificação prevista na norma para instalações, nos termos delimitados na abertura de 3.4.2.</w:t>
       </w:r>
     </w:p>
@@ -16072,6 +16061,7 @@
         <w:rPr>
           <w:lang w:val="pt-BR"/>
         </w:rPr>
+        <w:lastRenderedPageBreak/>
         <w:t>sem acrescentar resultado. O controle coordenado de múltiplas luminárias é registrado entre as limitações e entre as recomendações de 6.1.</w:t>
       </w:r>
     </w:p>
@@ -16159,6 +16149,7 @@
         <w:rPr>
           <w:lang w:val="pt-BR"/>
         </w:rPr>
+        <w:lastRenderedPageBreak/>
         <w:t>ação em segundos, e o alerta só é aberto após doze leituras, o que praticamente elimina o alarme falso. Como o nó responde a cada comando, e o comando só é emitido quando o alvo muda ou precisa ser renovado (3.5.2), as leituras são espaçadas, e o alerta de perda de controle leva dezenas de minutos para ser aberto. Em ambos os casos o alerta é registro: não altera o nível de iluminação, função que cabe exclusivamente ao failsafe do nó.</w:t>
       </w:r>
     </w:p>
@@ -16223,6 +16214,7 @@
         <w:rPr>
           <w:lang w:val="pt-BR"/>
         </w:rPr>
+        <w:lastRenderedPageBreak/>
         <w:t>3.5 Dados urbanos e construção dos cenários</w:t>
       </w:r>
       <w:bookmarkEnd w:id="34"/>
@@ -16360,6 +16352,7 @@
         <w:rPr>
           <w:lang w:val="pt-BR"/>
         </w:rPr>
+        <w:lastRenderedPageBreak/>
         <w:t>câmera observa a via que qual luminária ilumina. A plataforma publica, por isso, dois tipos de informação por trecho de via. O primeiro é o volume de movimentação: a média de pessoas presentes na área do trecho num período de 5 min. O segundo é a ocorrência de segurança ou de trânsito, publicada no momento em que é detectada, e o seu encerramento. A plataforma entrega contagem, e não nível normalizado: quem conhece a via é o serviço de decisão, que compara o volume com o movimento habitual daquele trecho (3.6).</w:t>
       </w:r>
     </w:p>
@@ -16414,6 +16407,7 @@
         <w:rPr>
           <w:lang w:val="pt-BR"/>
         </w:rPr>
+        <w:lastRenderedPageBreak/>
         <w:t>derivada reforça a proteção de dados de 3.10: a média de um período diz ainda menos sobre cada pessoa do que a contagem de um instante.</w:t>
       </w:r>
     </w:p>
@@ -16468,6 +16462,7 @@
         <w:rPr>
           <w:lang w:val="pt-BR"/>
         </w:rPr>
+        <w:lastRenderedPageBreak/>
         <w:t>a atenuação. O segundo é que o cadastro tem ruído — placa duplicada, poste a mais de 25 m de qualquer trecho, endereço em texto livre —, e por isso a associação é geométrica, e não por nome de rua.</w:t>
       </w:r>
     </w:p>
@@ -16539,6 +16534,7 @@
         <w:rPr>
           <w:lang w:val="pt-BR"/>
         </w:rPr>
+        <w:lastRenderedPageBreak/>
         <w:t>constatação que o próprio trabalho denuncia: o município de São Paulo não disponibiliza série dessa natureza em seu portal de dados abertos. A consulta ao catálogo municipal, realizada em setembro de 2026, retorna para o termo pedestre um único conjunto, o cadastro de lombadas; e os dois conjuntos intitulados fluxo de pessoas correspondem a relatórios mensais de público de equipamentos concedidos, sem granularidade horária e sem referência a via pública. A contagem de pessoas é exigida contratualmente da plataforma municipal de videomonitoramento, conforme documentado em 2.3, e não é publicada.</w:t>
       </w:r>
     </w:p>
@@ -16593,6 +16589,7 @@
         <w:rPr>
           <w:lang w:val="pt-BR"/>
         </w:rPr>
+        <w:lastRenderedPageBreak/>
         <w:t>sem ajuste de hiperparâmetros: uma regressão linear, o modelo mais simples da família, e uma floresta aleatória, o outro modelo de árvores de uso corrente. A regra de leitura foi registrada antes do treino: há superioridade quando o erro absoluto médio é ao menos 2 % menor e menor na maioria dos sensores; diferença abaixo de 2 % é equivalência. A comparação é o que separa aprendizado de ornamento: caso o modelo treinado não supere as referências, o resultado é reportado como tal, e a conclusão é que um perfil horário fixo bastaria ao caso — achado igualmente informativo para a especificação da interface.</w:t>
       </w:r>
     </w:p>
@@ -16641,6 +16638,7 @@
         <w:rPr>
           <w:lang w:val="pt-BR"/>
         </w:rPr>
+        <w:lastRenderedPageBreak/>
         <w:t>A régua segue quatro requisitos do projeto: escala de 0, via vazia, a 1, o cheio típico da via; pouca influência de eventos raros; estabilidade com 28 dias de dado; e cálculo simples, trecho a trecho, no banco. A normalização pelo máximo deixaria um único evento definir a escala; a padronização pela média e pelo desvio produz valores negativos e sem limite; a escala pela mediana e pela dispersão central cresce sem controle à noite, quando a mediana é quase zero; e a transformação em postos perde a proporção entre os volumes. Em 28 dias, o percentil 99 é definido por cerca dos 27 blocos mais cheios: o bastante para a estimativa ser estável, e pouco o bastante para deixar os eventos raros acima dela, onde o nível é limitado a 1. O valor 99 é critério dos autores. Num teste de sensibilidade feito depois da escolha, trocar o 99 por 95, 99,5 ou 99,9 manteve a mesma faixa de movimentação em 95,7 % a 99,2 % dos blocos noturnos de 2019, pela régua do treino e pela de 28 dias; o percentil 95 deixa 5,5 % dos blocos no limite de 1, e a variação diária da régua ficou abaixo de 5 % em 95 % dos dias, nos quatro percentis.</w:t>
       </w:r>
     </w:p>
@@ -16679,6 +16677,7 @@
         <w:rPr>
           <w:lang w:val="pt-BR"/>
         </w:rPr>
+        <w:lastRenderedPageBreak/>
         <w:t>superar a melhor referência simples, no período noturno, em ao menos 2 pontos percentuais no acerto da faixa e em ao menos 0,02 na medida F1 — foi mantido para o modelo em operação. Os limiares são critério dos autores, e não valor de norma ou de literatura; o que lhes dá validade é terem sido fixados antes do resultado. Fica, da série de Melbourne, um achado: quando o dado de movimento só existe por hora, o modelo treinado é substituível por uma média sazonal, e a solução entrega menos do que a sua arquitetura permite.</w:t>
       </w:r>
     </w:p>
@@ -17243,6 +17242,7 @@
                 <w:szCs w:val="20"/>
                 <w:lang w:val="pt-BR"/>
               </w:rPr>
+              <w:lastRenderedPageBreak/>
               <w:t>Classe de iluminação da via</w:t>
             </w:r>
           </w:p>
@@ -17336,6 +17336,7 @@
         <w:rPr>
           <w:lang w:val="pt-BR"/>
         </w:rPr>
+        <w:lastRenderedPageBreak/>
         <w:t>a faixa horária é fixada pelo relógio e a classe de iluminação é atributo do ponto de luz.</w:t>
       </w:r>
     </w:p>
@@ -17390,6 +17391,7 @@
         <w:rPr>
           <w:lang w:val="pt-BR"/>
         </w:rPr>
+        <w:lastRenderedPageBreak/>
         <w:t>da tabela de classes (RF09): para a classe P3, os degraus valem 1,0, 0,75 e 0,5 do pleno, isto é, as classes P3, P4 e P5 do Quadro 8, e nenhum desses valores reside no código. Classes com menos degraus disponíveis os repetem, e uma classe não dimerizável permanece sempre no pleno. O piso continua a ser imposto pela camada de verificação, que o lê da mesma tabela e não depende da inferência, o que torna contável, no registro, cada correção que a verificação impõe.</w:t>
       </w:r>
     </w:p>
@@ -17428,6 +17430,7 @@
         <w:rPr>
           <w:lang w:val="pt-BR"/>
         </w:rPr>
+        <w:lastRenderedPageBreak/>
         <w:t>mudar as sete regras. Cada decisão grava ainda as entradas da inferência e o grau com que cada regra foi ativada, o que permite explicá-la regra a regra.</w:t>
       </w:r>
     </w:p>
@@ -17482,6 +17485,7 @@
         <w:rPr>
           <w:lang w:val="pt-BR"/>
         </w:rPr>
+        <w:lastRenderedPageBreak/>
         <w:t>o sentido mais vezes (4.6). O trabalho declara, por isso, que a pertinência parcial é a forma de expressão e de execução da base de regras, com efeito medido na suavidade da resposta, e não componente cuja retirada degrade a segurança ou o consumo. Um último confronto empregou noites reais com contagem de 15 min, contou apenas as mudanças de nível perceptíveis e incluiu uma tabela com histerese de descida; também nele a inferência nebulosa não superou as tabelas (4.6).</w:t>
       </w:r>
     </w:p>
@@ -17560,6 +17564,7 @@
         <w:rPr>
           <w:lang w:val="pt-BR"/>
         </w:rPr>
+        <w:lastRenderedPageBreak/>
         <w:t>queda admitida para baixo. A taxa, prescrita pela norma de forma geral e não por classe, é gravada como atributo de cada classe, conforme o Quadro 16.</w:t>
       </w:r>
     </w:p>
@@ -17647,6 +17652,7 @@
         <w:rPr>
           <w:lang w:val="pt-BR"/>
         </w:rPr>
+        <w:lastRenderedPageBreak/>
         <w:t>presença de veículos estacionados; e luminância de ambiente moderada. A soma dos fatores de ponderação conduz, pela equação normativa de seleção, à classe P3.</w:t>
       </w:r>
     </w:p>
@@ -18342,6 +18348,7 @@
         <w:rPr>
           <w:lang w:val="pt-BR"/>
         </w:rPr>
+        <w:lastRenderedPageBreak/>
         <w:t xml:space="preserve">Etapa 4 — Verificação do invariante de segurança. Submete-se o sistema à suíte de cenários e verifica-se, para cada decisão emitida, se algum dos dois limites normativos foi transgredido. A avaliação é exaustiva e o critério é categórico: nenhuma violação é admitida. Incluem-se cenários adversariais, construídos para induzir a inferência a produzir decisão inadmissível, de modo que a verificação seja submetida a esforço e não apenas exercitada. Os cenários correm em relógio virtual, com passo igual ao da rampa do nó, de 5 s, o que torna a suíte repetível e rápida sem alterar a rampa, que continua limitada a um décimo por minuto; o serviço decide e publica como em operação (3.5.2), e um nó virtual, com a mesma regra do nó físico, produz o nível de cada passo, sobre o qual se contam as violações; cada execução enxerga apenas os eventos que ela própria publicou. </w:t>
       </w:r>
       <w:proofErr w:type="spellStart"/>
@@ -18482,6 +18489,7 @@
         <w:rPr>
           <w:lang w:val="pt-BR"/>
         </w:rPr>
+        <w:lastRenderedPageBreak/>
         <w:t>energia estimada para o regime adaptativo e para as duas linhas de base e reporta-se, ao lado de cada valor, a aderência ao envelope esperado, conforme 3.11. Produz o objetivo específico i).</w:t>
       </w:r>
     </w:p>
@@ -18536,6 +18544,7 @@
         <w:rPr>
           <w:lang w:val="pt-BR"/>
         </w:rPr>
+        <w:lastRenderedPageBreak/>
         <w:t>mantém o nível acima do modo reativo, a fração em que o volume real da hora seguinte saiu da faixa baixa. A terceira é a luz perdida pela falha de contagem, diferença média de nível entre o cenário sem falha e o cenário com falha. A quarta descreve a forma da resposta: variação total do nível, inversões de sentido e subidas de ao menos 0,1 em um passo. A série de Zurique é de 15 min, e nesses cenários o volume de 5 min repete o valor do bloco, limitação que 5.3 registra. A linha de base de horário fixo é avaliada no horário local do ponto de luz. O Apêndice B indica, para cada resultado, o programa, os dados e o comando que o reproduzem.</w:t>
       </w:r>
     </w:p>
@@ -18574,6 +18583,7 @@
         <w:rPr>
           <w:lang w:val="pt-BR"/>
         </w:rPr>
+        <w:lastRenderedPageBreak/>
         <w:t>coerência entre a base de regras e esse julgamento — não a correção da decisão em sentido absoluto. A declaração é necessária porque a alternativa, calar sobre a origem do envelope, apresentaria como validação externa aquilo que é, em parte, consistência interna.</w:t>
       </w:r>
     </w:p>
@@ -18781,6 +18791,7 @@
         <w:rPr>
           <w:lang w:val="pt-BR"/>
         </w:rPr>
+        <w:lastRenderedPageBreak/>
         <w:t>tratamento de dado pessoal sujeito à Lei Geral de Proteção de Dados Pessoais (BRASIL, 2018). O presente trabalho não acessa, não reproduz e não depende dessas funcionalidades: a informação que o sistema consome é a descrição agregada do estado da via. Essa distinção é relevante também para a proposta de integração: o que se propõe consumir é o alerta de evento e a contagem agregada, e não o conteúdo de imagem ou a identificação de pessoas. Uma integração efetiva exigiria tratamento jurídico próprio, registrado entre as limitações.</w:t>
       </w:r>
     </w:p>
@@ -18852,6 +18863,7 @@
         <w:rPr>
           <w:lang w:val="pt-BR"/>
         </w:rPr>
+        <w:lastRenderedPageBreak/>
         <w:t>de comprimento, e o comprimento do segmento é fixado por medição conforme 3.4.2, de modo que a potência a ciclo de trabalho pleno é conhecida. O nível aplicado em cada passo da rampa é registrado pelo nó na sua saída serial, e o ciclo de trabalho correspondente decorre da tabela de calibração; a telemetria, gravada conforme o modelo de dados de 3.13.1, só ocorre quando chega um comando e não cobre os passos intermediários. A energia consumida em um cenário é, então, a soma dos produtos entre a potência plena, o ciclo de trabalho de cada intervalo e a duração desse intervalo.</w:t>
       </w:r>
     </w:p>
@@ -19109,6 +19121,7 @@
                 <w:sz w:val="20"/>
                 <w:szCs w:val="20"/>
               </w:rPr>
+              <w:lastRenderedPageBreak/>
               <w:t xml:space="preserve">Eficácia </w:t>
             </w:r>
             <w:proofErr w:type="spellStart"/>
@@ -19538,6 +19551,7 @@
         <w:rPr>
           <w:lang w:val="pt-BR"/>
         </w:rPr>
+        <w:lastRenderedPageBreak/>
         <w:t>menores valores absolutos de economia e é o caso em que o viés declarado ao final desta subseção pesa mais.</w:t>
       </w:r>
     </w:p>
@@ -19608,6 +19622,7 @@
         <w:rPr>
           <w:lang w:val="pt-BR"/>
         </w:rPr>
+        <w:lastRenderedPageBreak/>
         <w:t>atuam no mesmo sentido — a redução de consumo real é menor que a proporcional à redução de fluxo —, e a parcela fixa pesa tanto mais quanto menor a potência nominal. A estimativa é, portanto, um limite superior otimista, e assim é reportada. Não se afirma economia anual, economia em escala de parque nem valor monetário: a suíte de cenários não constitui perfil anual de ocupação do município, e multiplicar seu resultado pelo número de pontos do parque atribuiria à suíte uma representatividade que ela não tem. A quantificação em equipamento viário, com medição elétrica rastreável, figura entre as recomendações de 6.1.</w:t>
       </w:r>
     </w:p>
@@ -19625,6 +19640,7 @@
         <w:rPr>
           <w:lang w:val="pt-BR"/>
         </w:rPr>
+        <w:lastRenderedPageBreak/>
         <w:t>3.12 Engenharia de software</w:t>
       </w:r>
       <w:bookmarkEnd w:id="43"/>
@@ -19675,7 +19691,7 @@
         <w:rPr>
           <w:lang w:val="pt-BR"/>
         </w:rPr>
-        <w:t xml:space="preserve">As partes interessadas foram identificadas a partir dos documentos que regem o serviço de iluminação pública e a plataforma de monitoramento do município. São cinco: o município, titular do serviço, interessado em reduzir o consumo sem comprometer a segurança e sem descumprir o contrato; a concessionária, responsável pela operação da telegestão e aferida pelo indicador de nível de iluminamento do contrato (2.5); o operador da plataforma de monitoramento, cujos dados passam a servir a uma segunda finalidade, sem que trafegue dado pessoal (3.10); o pedestre, destinatário final da luz, a quem interessa iluminação adequada quando há circulação na via; e o organismo normativo, representado pela ABNT NBR 5101, que não é parte em sentido estrito, mas impõe as restrições que o sistema não pode violar.</w:t>
+        <w:t>As partes interessadas foram identificadas a partir dos documentos que regem o serviço de iluminação pública e a plataforma de monitoramento do município. São cinco: o município, titular do serviço, interessado em reduzir o consumo sem comprometer a segurança e sem descumprir o contrato; a concessionária, responsável pela operação da telegestão e aferida pelo indicador de nível de iluminamento do contrato (2.5); o operador da plataforma de monitoramento, cujos dados passam a servir a uma segunda finalidade, sem que trafegue dado pessoal (3.10); o pedestre, destinatário final da luz, a quem interessa iluminação adequada quando há circulação na via; e o organismo normativo, representado pela ABNT NBR 5101, que não é parte em sentido estrito, mas impõe as restrições que o sistema não pode violar.</w:t>
       </w:r>
     </w:p>
     <w:p>
@@ -19688,7 +19704,14 @@
         <w:rPr>
           <w:lang w:val="pt-BR"/>
         </w:rPr>
-        <w:t xml:space="preserve">A elicitação foi exclusivamente documental: não houve entrevista nem consulta a representantes dessas partes. Os requisitos foram extraídos das fontes primárias — o contrato de concessão e seu Caderno de Encargos, o Termo de Referência da plataforma de monitoramento e a norma —, e a coluna de origem do Quadro 10 registra, para cada requisito, a seção do trabalho que o fundamenta. A delimitação seguiu o recorte de 1.7 — pedestres, uma classe de iluminação e um nó de bancada —, e a validação deu-se pela associação de cada requisito a ao menos um caso de teste (Quadro 15), executado conforme 3.12.9. A ausência de validação junto às partes interessadas é uma limitação do trabalho: os requisitos expressam o que os documentos oficiais exigem, e não o que os operadores do serviço confirmariam.</w:t>
+        <w:t xml:space="preserve">A elicitação foi exclusivamente documental: não houve entrevista nem consulta a representantes dessas partes. Os requisitos foram extraídos das fontes primárias — o contrato de concessão e seu Caderno de Encargos, o Termo de Referência da plataforma de monitoramento e a norma —, e a coluna de origem do Quadro 10 registra, para cada requisito, a seção do trabalho que o fundamenta. A delimitação seguiu o recorte de 1.7 — pedestres, uma classe de iluminação e um nó de bancada —, e a validação deu-se pela associação de cada requisito a ao menos um caso de teste (Quadro 15), executado conforme 3.12.9. A ausência de validação junto às </w:t>
+      </w:r>
+      <w:r>
+        <w:rPr>
+          <w:lang w:val="pt-BR"/>
+        </w:rPr>
+        <w:lastRenderedPageBreak/>
+        <w:t>partes interessadas é uma limitação do trabalho: os requisitos expressam o que os documentos oficiais exigem, e não o que os operadores do serviço confirmariam.</w:t>
       </w:r>
     </w:p>
     <w:p>
@@ -19721,7 +19744,7 @@
         <w:rPr>
           <w:lang w:val="pt-BR"/>
         </w:rPr>
-        <w:t xml:space="preserve">O desenvolvimento seguiu processo iterativo e incremental, guiado pela especificação. O texto do trabalho foi escrito antes do código e funcionou como especificação: requisitos, arquitetura e modelo de dados foram fixados no documento, e cada incremento do protótipo foi implementado e testado contra eles antes do seguinte, na ordem banco de dados, camada de verificação, inferência, interface de dados, ciclo de decisão, modelo de previsão, suíte de cenários, painel, firmware do nó e implantação em nuvem. Sempre que a implementação revelou a necessidade de divergir do texto, a decisão foi registrada em arquivo próprio do repositório, com o motivo e a alternativa descartada, e o texto foi revisado na versão seguinte; os critérios de cada avaliação foram fixados em protocolo antes da execução correspondente (Apêndice B). O código foi produzido em programação em par com ferramenta de inteligência artificial, nos termos do Apêndice A.</w:t>
+        <w:t>O desenvolvimento seguiu processo iterativo e incremental, guiado pela especificação. O texto do trabalho foi escrito antes do código e funcionou como especificação: requisitos, arquitetura e modelo de dados foram fixados no documento, e cada incremento do protótipo foi implementado e testado contra eles antes do seguinte, na ordem banco de dados, camada de verificação, inferência, interface de dados, ciclo de decisão, modelo de previsão, suíte de cenários, painel, firmware do nó e implantação em nuvem. Sempre que a implementação revelou a necessidade de divergir do texto, a decisão foi registrada em arquivo próprio do repositório, com o motivo e a alternativa descartada, e o texto foi revisado na versão seguinte; os critérios de cada avaliação foram fixados em protocolo antes da execução correspondente (Apêndice B). O código foi produzido em programação em par com ferramenta de inteligência artificial, nos termos do Apêndice A.</w:t>
       </w:r>
     </w:p>
     <w:p>
@@ -19734,7 +19757,7 @@
         <w:rPr>
           <w:lang w:val="pt-BR"/>
         </w:rPr>
-        <w:t xml:space="preserve">A divisão do trabalho acompanhou essa organização: Vitor Oliveira dos Santos ficou responsável pelo desenvolvimento do software e pela montagem do nó de bancada, e Bruno Bonavigo Dacal e Lucas de Araujo Vergara, pela documentação e pelo apoio à pesquisa. O planejamento e o acompanhamento foram feitos no próprio repositório de código, cujo histórico de versões registra a sequência efetiva das atividades, apresentada em 3.12.8; a validação dos requisitos e a definição do protótipo seguiram o descrito em 3.12.1, 3.3 e 3.4.</w:t>
+        <w:t>A divisão do trabalho acompanhou essa organização: Vitor Oliveira dos Santos ficou responsável pelo desenvolvimento do software e pela montagem do nó de bancada, e Bruno Bonavigo Dacal e Lucas de Araujo Vergara, pela documentação e pelo apoio à pesquisa. O planejamento e o acompanhamento foram feitos no próprio repositório de código, cujo histórico de versões registra a sequência efetiva das atividades, apresentada em 3.12.8; a validação dos requisitos e a definição do protótipo seguiram o descrito em 3.12.1, 3.3 e 3.4.</w:t>
       </w:r>
     </w:p>
     <w:p>
@@ -19972,6 +19995,7 @@
                 <w:sz w:val="20"/>
                 <w:szCs w:val="20"/>
               </w:rPr>
+              <w:lastRenderedPageBreak/>
               <w:t>RF02</w:t>
             </w:r>
           </w:p>
@@ -20767,6 +20791,7 @@
           <w:szCs w:val="20"/>
           <w:lang w:val="pt-BR"/>
         </w:rPr>
+        <w:lastRenderedPageBreak/>
         <w:t>Quadro 11 – Requisitos não funcionais</w:t>
       </w:r>
     </w:p>
@@ -21982,13 +22007,14 @@
         <w:rPr>
           <w:lang w:val="pt-BR"/>
         </w:rPr>
-        <w:t xml:space="preserve">O RNF07 merece registro em separado, por ser a decisão de projeto que protege o sistema contra a própria falha. A iluminação pública é serviço cuja interrupção tem consequência sobre a segurança da via, e um sistema adaptativo acrescenta um modo de falha que o regime fixo não possui: a possibilidade de o comando não chegar. A regra adotada resolve o caso pelo lado conservador — sem comando, o nó ilumina plenamente. A consequência é que a falha do sistema degrada a operação para o regime convencional, e não para a escuridão. É a mesma lógica </w:t>
-      </w:r>
-      <w:r>
-        <w:rPr>
-          <w:lang w:val="pt-BR"/>
-        </w:rPr>
-        <w:t>que rege a camada de verificação: o benefício da adaptação é condicional, a garantia normativa não é.</w:t>
+        <w:t xml:space="preserve">O RNF07 merece registro em separado, por ser a decisão de projeto que protege o sistema contra a própria falha. A iluminação pública é serviço cuja interrupção tem consequência sobre a segurança da via, e um sistema adaptativo acrescenta um modo de falha que o regime fixo não possui: a possibilidade de o comando não chegar. A regra adotada resolve o caso pelo lado conservador — sem </w:t>
+      </w:r>
+      <w:r>
+        <w:rPr>
+          <w:lang w:val="pt-BR"/>
+        </w:rPr>
+        <w:lastRenderedPageBreak/>
+        <w:t>comando, o nó ilumina plenamente. A consequência é que a falha do sistema degrada a operação para o regime convencional, e não para a escuridão. É a mesma lógica que rege a camada de verificação: o benefício da adaptação é condicional, a garantia normativa não é.</w:t>
       </w:r>
     </w:p>
     <w:p>
@@ -22021,7 +22047,7 @@
         <w:rPr>
           <w:lang w:val="pt-BR"/>
         </w:rPr>
-        <w:t xml:space="preserve">A Figura 3 apresenta o diagrama de casos de uso, derivado dos requisitos funcionais do Quadro 10. Quatro atores interagem com o sistema: a plataforma de monitoramento, que publica o volume ou a ocorrência de um trecho; o operador municipal, que acompanha as decisões no painel, consulta a estimativa de consumo e altera, por operação sobre dado, a classe e os parâmetros normativos; o nó de iluminação, que recebe o comando, aplica o nível, mede a luz e fornece a leitura que alimenta o diagnóstico; e o avaliador, que reproduz a suíte de cenários. A publicação de um evento inclui a decisão do nível, que por sua vez inclui a previsão da demanda, a verificação contra a norma — da qual depende a emissão do comando — e o registro da cadeia.</w:t>
+        <w:t>A Figura 3 apresenta o diagrama de casos de uso, derivado dos requisitos funcionais do Quadro 10. Quatro atores interagem com o sistema: a plataforma de monitoramento, que publica o volume ou a ocorrência de um trecho; o operador municipal, que acompanha as decisões no painel, consulta a estimativa de consumo e altera, por operação sobre dado, a classe e os parâmetros normativos; o nó de iluminação, que recebe o comando, aplica o nível, mede a luz e fornece a leitura que alimenta o diagnóstico; e o avaliador, que reproduz a suíte de cenários. A publicação de um evento inclui a decisão do nível, que por sua vez inclui a previsão da demanda, a verificação contra a norma — da qual depende a emissão do comando — e o registro da cadeia.</w:t>
       </w:r>
     </w:p>
     <w:p>
@@ -22036,7 +22062,8 @@
           <w:szCs w:val="20"/>
           <w:lang w:val="pt-BR"/>
         </w:rPr>
-        <w:t xml:space="preserve">Figura 3 – Diagrama de casos de uso</w:t>
+        <w:lastRenderedPageBreak/>
+        <w:t>Figura 3 – Diagrama de casos de uso</w:t>
       </w:r>
     </w:p>
     <w:p>
@@ -22069,7 +22096,7 @@
                     <pic:cNvPicPr/>
                   </pic:nvPicPr>
                   <pic:blipFill>
-                    <a:blip r:embed="rIdCasosUso"/>
+                    <a:blip r:embed="rId10"/>
                     <a:stretch>
                       <a:fillRect/>
                     </a:stretch>
@@ -22101,7 +22128,7 @@
           <w:szCs w:val="20"/>
           <w:lang w:val="pt-BR"/>
         </w:rPr>
-        <w:t xml:space="preserve">Fonte: Elaborado pelos autores (2026).</w:t>
+        <w:t>Fonte: Elaborado pelos autores (2026).</w:t>
       </w:r>
     </w:p>
     <w:p>
@@ -22134,19 +22161,7 @@
         <w:rPr>
           <w:lang w:val="pt-BR"/>
         </w:rPr>
-        <w:t xml:space="preserve">A </w:t>
-      </w:r>
-      <w:r>
-        <w:rPr>
-          <w:lang w:val="pt-BR"/>
-        </w:rPr>
-        <w:t xml:space="preserve">Figura 4</w:t>
-      </w:r>
-      <w:r>
-        <w:rPr>
-          <w:lang w:val="pt-BR"/>
-        </w:rPr>
-        <w:t xml:space="preserve"> apresenta o sistema em sua totalidade. O fluxo principal percorre quatro estágios encadeados, todos executados em nuvem, e termina em um quinto estágio físico: o evento urbano é publicado na interface de dados, o serviço de decisão produz a estimativa de demanda e submete o estado resultante à inferência nebulosa, a camada de verificação confronta o nível pretendido com o piso da ABNT NBR 5101 e o corrige quando necessário, o intermediário de mensagens entrega o comando já verificado e o nó de iluminação o executa sob a taxa máxima de decréscimo, devolvendo a iluminância medida. Em paralelo corre um segundo percurso, representado em tracejado: cada estágio grava no banco de dados o que recebeu e o que produziu, e é desse registro que o painel de acompanhamento se alimenta.</w:t>
+        <w:t>A Figura 4 apresenta o sistema em sua totalidade. O fluxo principal percorre quatro estágios encadeados, todos executados em nuvem, e termina em um quinto estágio físico: o evento urbano é publicado na interface de dados, o serviço de decisão produz a estimativa de demanda e submete o estado resultante à inferência nebulosa, a camada de verificação confronta o nível pretendido com o piso da ABNT NBR 5101 e o corrige quando necessário, o intermediário de mensagens entrega o comando já verificado e o nó de iluminação o executa sob a taxa máxima de decréscimo, devolvendo a iluminância medida. Em paralelo corre um segundo percurso, representado em tracejado: cada estágio grava no banco de dados o que recebeu e o que produziu, e é desse registro que o painel de acompanhamento se alimenta.</w:t>
       </w:r>
     </w:p>
     <w:p>
@@ -22164,15 +22179,8 @@
           <w:szCs w:val="20"/>
           <w:lang w:val="pt-BR"/>
         </w:rPr>
-        <w:t xml:space="preserve">Figura 4</w:t>
-      </w:r>
-      <w:r>
-        <w:rPr>
-          <w:sz w:val="20"/>
-          <w:szCs w:val="20"/>
-          <w:lang w:val="pt-BR"/>
-        </w:rPr>
-        <w:t xml:space="preserve"> – Arquitetura do sistema</w:t>
+        <w:lastRenderedPageBreak/>
+        <w:t>Figura 4 – Arquitetura do sistema</w:t>
       </w:r>
     </w:p>
     <w:p>
@@ -22205,7 +22213,7 @@
                     <pic:cNvPicPr/>
                   </pic:nvPicPr>
                   <pic:blipFill>
-                    <a:blip r:embed="rId10"/>
+                    <a:blip r:embed="rId11"/>
                     <a:stretch>
                       <a:fillRect/>
                     </a:stretch>
@@ -22289,6 +22297,7 @@
           <w:szCs w:val="20"/>
           <w:lang w:val="pt-BR"/>
         </w:rPr>
+        <w:lastRenderedPageBreak/>
         <w:t>Quadro 12 – Decisões de arquitetura</w:t>
       </w:r>
     </w:p>
@@ -22693,15 +22702,7 @@
                 <w:szCs w:val="20"/>
                 <w:lang w:val="pt-BR"/>
               </w:rPr>
-              <w:t xml:space="preserve">Sim. Banco relacional em contêiner, com as entidades do Quadro 16 e o modelo da </w:t>
-            </w:r>
-            <w:r>
-              <w:rPr>
-                <w:sz w:val="20"/>
-                <w:szCs w:val="20"/>
-                <w:lang w:val="pt-BR"/>
-              </w:rPr>
-              <w:t xml:space="preserve">Figura 10</w:t>
+              <w:t>Sim. Banco relacional em contêiner, com as entidades do Quadro 16 e o modelo da Figura 10</w:t>
             </w:r>
           </w:p>
         </w:tc>
@@ -23145,6 +23146,7 @@
           <w:szCs w:val="20"/>
           <w:lang w:val="pt-BR"/>
         </w:rPr>
+        <w:lastRenderedPageBreak/>
         <w:t>Quadro 13 – Componentes, tecnologias adotadas e responsabilidades</w:t>
       </w:r>
     </w:p>
@@ -24145,6 +24147,7 @@
         <w:rPr>
           <w:lang w:val="pt-BR"/>
         </w:rPr>
+        <w:lastRenderedPageBreak/>
         <w:t xml:space="preserve">máquina virtual em nuvem; a exceção é o painel, aplicação estática publicada à parte. Ao nó cabe executar. </w:t>
       </w:r>
       <w:r>
@@ -24280,6 +24283,7 @@
         <w:rPr>
           <w:lang w:val="pt-BR"/>
         </w:rPr>
+        <w:lastRenderedPageBreak/>
         <w:t>Ao nó cabe assinar o tópico de comando, ajustar a modulação por largura de pulso e publicar a iluminância lida. A comunicação com o intermediário ocorre sobre canal cifrado, com credencial própria do dispositivo, de modo que a identidade de cada nó seja verificável no lado do serviço. O canal é autenticado por certificado de autoridade certificadora própria, gravado no firmware, e uma regra de acesso vinculada à credencial faz com que cada nó só assine o próprio tópico de comando e só publique a própria telemetria. O serviço de decisão alcança o intermediário pela rede interna da máquina virtual, sem porta exposta, e o banco não é publicado. Na interface REST, a publicação exige chave de acesso; as consultas permanecem abertas, porque o painel apenas lê.</w:t>
       </w:r>
     </w:p>
@@ -24535,6 +24539,7 @@
                 <w:szCs w:val="20"/>
                 <w:lang w:val="pt-BR"/>
               </w:rPr>
+              <w:lastRenderedPageBreak/>
               <w:t>origem; vigência opcional. Exige chave de acesso; campo fora do contrato ou trecho fora do cadastro recusa o item, e no pacote só ele</w:t>
             </w:r>
           </w:p>
@@ -24557,6 +24562,7 @@
                 <w:sz w:val="20"/>
                 <w:szCs w:val="20"/>
               </w:rPr>
+              <w:lastRenderedPageBreak/>
               <w:t>REST – GET /</w:t>
             </w:r>
             <w:proofErr w:type="spellStart"/>
@@ -25681,6 +25687,7 @@
                 <w:sz w:val="20"/>
                 <w:szCs w:val="20"/>
               </w:rPr>
+              <w:lastRenderedPageBreak/>
               <w:t xml:space="preserve">MQTT – </w:t>
             </w:r>
             <w:proofErr w:type="spellStart"/>
@@ -25858,19 +25865,7 @@
         <w:rPr>
           <w:lang w:val="pt-BR"/>
         </w:rPr>
-        <w:t xml:space="preserve">A </w:t>
-      </w:r>
-      <w:r>
-        <w:rPr>
-          <w:lang w:val="pt-BR"/>
-        </w:rPr>
-        <w:t xml:space="preserve">Figura 5</w:t>
-      </w:r>
-      <w:r>
-        <w:rPr>
-          <w:lang w:val="pt-BR"/>
-        </w:rPr>
-        <w:t xml:space="preserve"> apresenta a sequência de mensagens de uma decisão, do recebimento do dado à exibição no painel. Os números da figura correspondem aos passos descritos em seguida.</w:t>
+        <w:t>A Figura 5 apresenta a sequência de mensagens de uma decisão, do recebimento do dado à exibição no painel. Os números da figura correspondem aos passos descritos em seguida.</w:t>
       </w:r>
     </w:p>
     <w:p>
@@ -25888,15 +25883,8 @@
           <w:szCs w:val="20"/>
           <w:lang w:val="pt-BR"/>
         </w:rPr>
-        <w:t xml:space="preserve">Figura 5</w:t>
-      </w:r>
-      <w:r>
-        <w:rPr>
-          <w:sz w:val="20"/>
-          <w:szCs w:val="20"/>
-          <w:lang w:val="pt-BR"/>
-        </w:rPr>
-        <w:t xml:space="preserve"> – Sequência de mensagens de uma decisão</w:t>
+        <w:lastRenderedPageBreak/>
+        <w:t>Figura 5 – Sequência de mensagens de uma decisão</w:t>
       </w:r>
     </w:p>
     <w:p>
@@ -25926,7 +25914,7 @@
                     <pic:cNvPicPr/>
                   </pic:nvPicPr>
                   <pic:blipFill>
-                    <a:blip r:embed="rId11"/>
+                    <a:blip r:embed="rId12"/>
                     <a:stretch>
                       <a:fillRect/>
                     </a:stretch>
@@ -26025,6 +26013,7 @@
         <w:rPr>
           <w:lang w:val="pt-BR"/>
         </w:rPr>
+        <w:lastRenderedPageBreak/>
         <w:t>(4) Decisão. O volume, dividido pela referência do trecho, torna-se o nível observado; a camada de previsão estima o nível da próxima hora (3.6); a inferência nebulosa combina os dois, a ocorrência e a faixa horária e produz o nível pretendido (3.7); a camada de verificação aplica o piso e produz o nível-alvo emitido.</w:t>
       </w:r>
     </w:p>
@@ -26185,6 +26174,7 @@
         <w:rPr>
           <w:lang w:val="pt-BR"/>
         </w:rPr>
+        <w:lastRenderedPageBreak/>
         <w:t>O ponto de luz da bancada corresponde ao poste de placa IP0412418, de classe P3, ligado aos trechos 20159, 21198 e 22661. Com volume nulo nos três, o nível observado foi 0, e a previsão para a próxima hora também. Sem ocorrência aberta, a inferência ativou com grau 1,0 apenas a regra de movimentação observada baixa e prevista baixa, o que resultou no degrau 2 e no nível pretendido de 0,500, a classe mínima (P5). O nível pretendido já respeitava o piso, e a camada de verificação não aplicou restrição: o nível emitido foi 0,500. A decisão foi gravada ligada aos três eventos e, como o alvo mudou, o comando publicado foi:</w:t>
       </w:r>
     </w:p>
@@ -26265,48 +26255,13 @@
         <w:rPr>
           <w:lang w:val="pt-BR"/>
         </w:rPr>
-        <w:t xml:space="preserve">As </w:t>
-      </w:r>
-      <w:r>
-        <w:rPr>
-          <w:lang w:val="pt-BR"/>
-        </w:rPr>
-        <w:t xml:space="preserve">Figuras 6 e 7</w:t>
-      </w:r>
-      <w:r>
-        <w:rPr>
-          <w:lang w:val="pt-BR"/>
-        </w:rPr>
-        <w:t xml:space="preserve"> mostram o passo (10) no painel de acompanhamento, com dados do ambiente implantado em 10 de outubro de 2026. Na visão de monitoramento (</w:t>
-      </w:r>
-      <w:r>
-        <w:rPr>
-          <w:lang w:val="pt-BR"/>
-        </w:rPr>
-        <w:t xml:space="preserve">Figura 6</w:t>
-      </w:r>
-      <w:r>
-        <w:rPr>
-          <w:lang w:val="pt-BR"/>
-        </w:rPr>
-        <w:t xml:space="preserve">), os cartões percorrem a cadeia de uma decisão — o volume recebido, o nível pretendido pela inferência, o nível emitido depois da verificação e a luz entregue, com o estado do nó antes do comando —, e o gráfico traz a trajetória dos níveis contra o piso da classe. Na visão de decisões explicadas (</w:t>
-      </w:r>
-      <w:r>
-        <w:rPr>
-          <w:lang w:val="pt-BR"/>
-        </w:rPr>
-        <w:t xml:space="preserve">Figura 7</w:t>
-      </w:r>
-      <w:r>
-        <w:rPr>
-          <w:lang w:val="pt-BR"/>
-        </w:rPr>
-        <w:t xml:space="preserve">), cada publicação recebida abre a explicação regra a regra: no exemplo, o volume nulo nos três trechos ativou as regras R5 e R7, e o nível pretendido de 0,625 foi emitido sem correção; como </w:t>
-      </w:r>
-      <w:r>
-        <w:rPr>
-          <w:lang w:val="pt-BR"/>
-        </w:rPr>
+        <w:t xml:space="preserve">As Figuras 6 e 7 mostram o passo (10) no painel de acompanhamento, com dados do ambiente implantado em 10 de outubro de 2026. Na visão de monitoramento (Figura 6), os cartões percorrem a cadeia de uma decisão — o volume recebido, o nível pretendido pela inferência, o nível emitido depois da verificação e a luz entregue, com o estado do nó antes do comando —, e o gráfico traz a trajetória dos níveis contra o piso da classe. Na visão de decisões explicadas (Figura 7), cada publicação recebida abre a explicação regra a regra: no exemplo, o volume nulo nos três trechos ativou as regras R5 e R7, e o nível pretendido de 0,625 foi emitido sem correção; como </w:t>
+      </w:r>
+      <w:r>
+        <w:rPr>
+          <w:lang w:val="pt-BR"/>
+        </w:rPr>
+        <w:lastRenderedPageBreak/>
         <w:t>o alvo não mudou em relação à decisão anterior, não houve comando, e por isso a luz entregue aparece sem medição.</w:t>
       </w:r>
     </w:p>
@@ -26325,15 +26280,7 @@
           <w:szCs w:val="20"/>
           <w:lang w:val="pt-BR"/>
         </w:rPr>
-        <w:t xml:space="preserve">Figura 6</w:t>
-      </w:r>
-      <w:r>
-        <w:rPr>
-          <w:sz w:val="20"/>
-          <w:szCs w:val="20"/>
-          <w:lang w:val="pt-BR"/>
-        </w:rPr>
-        <w:t xml:space="preserve"> – Painel de acompanhamento: visão de monitoramento</w:t>
+        <w:t>Figura 6 – Painel de acompanhamento: visão de monitoramento</w:t>
       </w:r>
     </w:p>
     <w:p>
@@ -26365,7 +26312,7 @@
                     <pic:cNvPicPr/>
                   </pic:nvPicPr>
                   <pic:blipFill>
-                    <a:blip r:embed="rId12"/>
+                    <a:blip r:embed="rId13"/>
                     <a:stretch>
                       <a:fillRect/>
                     </a:stretch>
@@ -26418,15 +26365,7 @@
           <w:szCs w:val="20"/>
           <w:lang w:val="pt-BR"/>
         </w:rPr>
-        <w:t xml:space="preserve">Figura 7</w:t>
-      </w:r>
-      <w:r>
-        <w:rPr>
-          <w:sz w:val="20"/>
-          <w:szCs w:val="20"/>
-          <w:lang w:val="pt-BR"/>
-        </w:rPr>
-        <w:t xml:space="preserve"> – Painel de acompanhamento: decisão explicada regra a regra</w:t>
+        <w:t>Figura 7 – Painel de acompanhamento: decisão explicada regra a regra</w:t>
       </w:r>
     </w:p>
     <w:p>
@@ -26458,7 +26397,7 @@
                     <pic:cNvPicPr/>
                   </pic:nvPicPr>
                   <pic:blipFill>
-                    <a:blip r:embed="rId13"/>
+                    <a:blip r:embed="rId14"/>
                     <a:stretch>
                       <a:fillRect/>
                     </a:stretch>
@@ -26506,43 +26445,14 @@
         <w:rPr>
           <w:lang w:val="pt-BR"/>
         </w:rPr>
-        <w:t xml:space="preserve">As </w:t>
-      </w:r>
-      <w:r>
-        <w:rPr>
-          <w:lang w:val="pt-BR"/>
-        </w:rPr>
-        <w:t xml:space="preserve">Figuras 8 e 9</w:t>
-      </w:r>
-      <w:r>
-        <w:rPr>
-          <w:lang w:val="pt-BR"/>
-        </w:rPr>
-        <w:t xml:space="preserve"> completam a visão de monitoramento. O cartão de consumo (</w:t>
-      </w:r>
-      <w:r>
-        <w:rPr>
-          <w:lang w:val="pt-BR"/>
-        </w:rPr>
-        <w:t xml:space="preserve">Figura 8</w:t>
-      </w:r>
-      <w:r>
-        <w:rPr>
-          <w:lang w:val="pt-BR"/>
-        </w:rPr>
-        <w:t xml:space="preserve">) projeta, para a luminária de referência de 40 W (Quadro 9), a potência derivada da iluminância medida contra a do fluxo pleno, com a ressalva, exibida no próprio painel, de que se trata de estimativa e não de medição elétrica (3.11); na janela de 30 min da captura, que inclui os ensaios descritos nesta seção, o ponto consumiu 82,5 % do pleno. O registro de decisões (</w:t>
-      </w:r>
-      <w:r>
-        <w:rPr>
-          <w:lang w:val="pt-BR"/>
-        </w:rPr>
-        <w:t xml:space="preserve">Figura 9</w:t>
-      </w:r>
-      <w:r>
-        <w:rPr>
-          <w:lang w:val="pt-BR"/>
-        </w:rPr>
-        <w:t xml:space="preserve">) lista, para cada decisão, os níveis pretendido e emitido, a correção aplicada e a iluminância da telemetria correspondente, ao lado do diagnóstico do ponto e das publicações recebidas; as linhas sem iluminância são as decisões que mantiveram o alvo e, por isso, não geraram comando.</w:t>
+        <w:t xml:space="preserve">As Figuras 8 e 9 completam a visão de monitoramento. O cartão de consumo (Figura 8) projeta, para a luminária de referência de 40 W (Quadro 9), a potência derivada da iluminância medida contra a do fluxo pleno, com a ressalva, exibida no próprio painel, de que se trata de estimativa e não de medição elétrica (3.11); na janela de 30 min da captura, que inclui os ensaios descritos nesta seção, o ponto consumiu 82,5 % do pleno. O registro de decisões (Figura 9) lista, para cada decisão, os níveis pretendido e emitido, a correção aplicada e a iluminância da telemetria correspondente, ao lado do diagnóstico do ponto e das publicações recebidas; as </w:t>
+      </w:r>
+      <w:r>
+        <w:rPr>
+          <w:lang w:val="pt-BR"/>
+        </w:rPr>
+        <w:lastRenderedPageBreak/>
+        <w:t>linhas sem iluminância são as decisões que mantiveram o alvo e, por isso, não geraram comando.</w:t>
       </w:r>
     </w:p>
     <w:p>
@@ -26557,15 +26467,7 @@
           <w:szCs w:val="20"/>
           <w:lang w:val="pt-BR"/>
         </w:rPr>
-        <w:t xml:space="preserve">Figura 8</w:t>
-      </w:r>
-      <w:r>
-        <w:rPr>
-          <w:sz w:val="20"/>
-          <w:szCs w:val="20"/>
-          <w:lang w:val="pt-BR"/>
-        </w:rPr>
-        <w:t xml:space="preserve"> – Painel de acompanhamento: consumo estimado</w:t>
+        <w:t>Figura 8 – Painel de acompanhamento: consumo estimado</w:t>
       </w:r>
     </w:p>
     <w:p>
@@ -26597,7 +26499,7 @@
                     <pic:cNvPicPr/>
                   </pic:nvPicPr>
                   <pic:blipFill>
-                    <a:blip r:embed="rIdCaptura109"/>
+                    <a:blip r:embed="rId15"/>
                     <a:stretch>
                       <a:fillRect/>
                     </a:stretch>
@@ -26629,7 +26531,7 @@
           <w:szCs w:val="20"/>
           <w:lang w:val="pt-BR"/>
         </w:rPr>
-        <w:t xml:space="preserve">Fonte: Elaborado pelos autores (2026).</w:t>
+        <w:t>Fonte: Elaborado pelos autores (2026).</w:t>
       </w:r>
     </w:p>
     <w:p>
@@ -26644,15 +26546,7 @@
           <w:szCs w:val="20"/>
           <w:lang w:val="pt-BR"/>
         </w:rPr>
-        <w:t xml:space="preserve">Figura 9</w:t>
-      </w:r>
-      <w:r>
-        <w:rPr>
-          <w:sz w:val="20"/>
-          <w:szCs w:val="20"/>
-          <w:lang w:val="pt-BR"/>
-        </w:rPr>
-        <w:t xml:space="preserve"> – Painel de acompanhamento: registro de decisões, diagnóstico e publicações</w:t>
+        <w:t>Figura 9 – Painel de acompanhamento: registro de decisões, diagnóstico e publicações</w:t>
       </w:r>
     </w:p>
     <w:p>
@@ -26684,7 +26578,7 @@
                     <pic:cNvPicPr/>
                   </pic:nvPicPr>
                   <pic:blipFill>
-                    <a:blip r:embed="rIdCaptura110"/>
+                    <a:blip r:embed="rId16"/>
                     <a:stretch>
                       <a:fillRect/>
                     </a:stretch>
@@ -26716,7 +26610,7 @@
           <w:szCs w:val="20"/>
           <w:lang w:val="pt-BR"/>
         </w:rPr>
-        <w:t xml:space="preserve">Fonte: Elaborado pelos autores (2026).</w:t>
+        <w:t>Fonte: Elaborado pelos autores (2026).</w:t>
       </w:r>
     </w:p>
     <w:p>
@@ -26971,7 +26865,16 @@
                 <w:szCs w:val="20"/>
                 <w:lang w:val="pt-BR"/>
               </w:rPr>
-              <w:t>Publicação com campo fora do contrato, média negativa, volume com ocorrência, trecho fora do cadastro, pacote com item inválido ou sem chave de acesso</w:t>
+              <w:t xml:space="preserve">Publicação com campo fora do contrato, média negativa, volume </w:t>
+            </w:r>
+            <w:r>
+              <w:rPr>
+                <w:sz w:val="20"/>
+                <w:szCs w:val="20"/>
+                <w:lang w:val="pt-BR"/>
+              </w:rPr>
+              <w:lastRenderedPageBreak/>
+              <w:t>com ocorrência, trecho fora do cadastro, pacote com item inválido ou sem chave de acesso</w:t>
             </w:r>
           </w:p>
         </w:tc>
@@ -26997,6 +26900,7 @@
                 <w:szCs w:val="20"/>
                 <w:lang w:val="pt-BR"/>
               </w:rPr>
+              <w:lastRenderedPageBreak/>
               <w:t>Recusa com erro de validação ou de autenticação; no pacote, só o item inválido é recusado e os demais são gravados</w:t>
             </w:r>
           </w:p>
@@ -27918,6 +27822,7 @@
                 <w:sz w:val="20"/>
                 <w:szCs w:val="20"/>
               </w:rPr>
+              <w:lastRenderedPageBreak/>
               <w:t>CT11</w:t>
             </w:r>
           </w:p>
@@ -28898,7 +28803,8 @@
         <w:rPr>
           <w:lang w:val="pt-BR"/>
         </w:rPr>
-        <w:t xml:space="preserve">O cronograma efetivamente seguido é o registrado no histórico de versões do repositório (Apêndice B), iniciado com o trabalho, que resultou da transição de um tema anterior. As atividades distribuíram-se nas seguintes fases, em 2026:</w:t>
+        <w:lastRenderedPageBreak/>
+        <w:t>O cronograma efetivamente seguido é o registrado no histórico de versões do repositório (Apêndice B), iniciado com o trabalho, que resultou da transição de um tema anterior. As atividades distribuíram-se nas seguintes fases, em 2026:</w:t>
       </w:r>
     </w:p>
     <w:p>
@@ -28915,7 +28821,7 @@
         <w:rPr>
           <w:lang w:val="pt-BR"/>
         </w:rPr>
-        <w:t xml:space="preserve">16 de agosto a 13 de setembro: transição de tema e pesquisa documental, encerrada com o pré-projeto do tema atual.</w:t>
+        <w:t>16 de agosto a 13 de setembro: transição de tema e pesquisa documental, encerrada com o pré-projeto do tema atual.</w:t>
       </w:r>
     </w:p>
     <w:p>
@@ -28932,7 +28838,7 @@
         <w:rPr>
           <w:lang w:val="pt-BR"/>
         </w:rPr>
-        <w:t xml:space="preserve">15 a 21 de setembro: especificação no texto do trabalho e primeiros incrementos — banco de dados, camada de verificação normativa com a suíte do invariante de segurança, inferência nebulosa, interface de dados urbanos e ciclo de decisão.</w:t>
+        <w:t>15 a 21 de setembro: especificação no texto do trabalho e primeiros incrementos — banco de dados, camada de verificação normativa com a suíte do invariante de segurança, inferência nebulosa, interface de dados urbanos e ciclo de decisão.</w:t>
       </w:r>
     </w:p>
     <w:p>
@@ -28949,7 +28855,7 @@
         <w:rPr>
           <w:lang w:val="pt-BR"/>
         </w:rPr>
-        <w:t xml:space="preserve">22 a 27 de setembro: modelo de previsão, suíte de cenários, diagnóstico, estimativa de energia, painel, firmware do nó, implantação em máquina virtual e identificação espacial.</w:t>
+        <w:t>22 a 27 de setembro: modelo de previsão, suíte de cenários, diagnóstico, estimativa de energia, painel, firmware do nó, implantação em máquina virtual e identificação espacial.</w:t>
       </w:r>
     </w:p>
     <w:p>
@@ -28966,7 +28872,7 @@
         <w:rPr>
           <w:lang w:val="pt-BR"/>
         </w:rPr>
-        <w:t xml:space="preserve">29 de setembro a 1º de outubro: decisão por volume de 5 min com saída em degraus de classe e avaliação dos componentes de inteligência artificial, com protocolos fixados antes de cada execução.</w:t>
+        <w:t>29 de setembro a 1º de outubro: decisão por volume de 5 min com saída em degraus de classe e avaliação dos componentes de inteligência artificial, com protocolos fixados antes de cada execução.</w:t>
       </w:r>
     </w:p>
     <w:p>
@@ -28983,7 +28889,7 @@
         <w:rPr>
           <w:lang w:val="pt-BR"/>
         </w:rPr>
-        <w:t xml:space="preserve">3 a 5 de outubro: conferência da calibração e primeira sessão de bancada dos casos CT15 a CT20.</w:t>
+        <w:t>3 a 5 de outubro: conferência da calibração e primeira sessão de bancada dos casos CT15 a CT20.</w:t>
       </w:r>
     </w:p>
     <w:p>
@@ -29000,7 +28906,7 @@
         <w:rPr>
           <w:lang w:val="pt-BR"/>
         </w:rPr>
-        <w:t xml:space="preserve">6 a 9 de outubro: comparação de modelos, troca da série de treino para Zurique, base de regras vigente, arquitetura de implantação e teste de sensibilidade da régua.</w:t>
+        <w:t>6 a 9 de outubro: comparação de modelos, troca da série de treino para Zurique, base de regras vigente, arquitetura de implantação e teste de sensibilidade da régua.</w:t>
       </w:r>
     </w:p>
     <w:p>
@@ -29017,7 +28923,7 @@
         <w:rPr>
           <w:lang w:val="pt-BR"/>
         </w:rPr>
-        <w:t xml:space="preserve">10 de outubro: caixa nova da bancada, sessão final dos casos CT15 a CT20, estado do nó antes do comando na telemetria e consolidação dos resultados no texto.</w:t>
+        <w:t>10 de outubro: caixa nova da bancada, sessão final dos casos CT15 a CT20, estado do nó antes do comando na telemetria e consolidação dos resultados no texto.</w:t>
       </w:r>
     </w:p>
     <w:p>
@@ -29051,7 +28957,15 @@
           <w:highlight w:val="yellow"/>
           <w:lang w:val="pt-BR"/>
         </w:rPr>
-        <w:t>Os casos automatizados, CT01 a CT14, foram satisfeitos na última execução, com todos os testes aprovados. Os casos CT15 a CT20 foram executados em 10 de outubro de 2026, na caixa atual (Quadro 4), com a arquitetura de 3.5.2 e o firmware correspondente gravado no nó, ligado ao ambiente implantado e calibrado no início da sessão (3.4.4); o registro de cada caso está no repositório (Apêndice B). Os seis foram satisfeitos. No CT15, a iluminância medida ficou 0,7 % acima do valor esperado para o nível aplicado, dentro da tolerância de 3,4 %. No CT16, o alerta de falha total foi aberto após três leituras com a fonte da fita desligada e encerrado ao religá-la. No CT17, as trinta repetições ficaram abaixo de 1,5 s, contra o limite de 180 s. No CT18, o nó assumiu o nível pleno no instante em que venceu a validade do último comando, e o sensor registrou o pleno 2,3 s depois. No CT19, a conexão ao intermediário foi recusada sem credencial e com senha incorreta, e aceita com a credencial do nó, sobre canal TLS 1.3. No CT20, um segundo ponto de luz foi comandado sem alteração nem reinício do serviço de decisão, por meio do nó simulado, cuja iluminância é sintética. Uma sessão anterior, de 4 e 5 de outubro, na primeira caixa e com o failsafe de 15 s sem comando, está registrada no repositório e não compõe estes resultados; nela, o CT18 não foi satisfeito nos termos então fixados, porque o sensor registrou o pleno 17,3 s após o último comando, contra o limite de 15 s.</w:t>
+        <w:t xml:space="preserve">Os casos automatizados, CT01 a CT14, foram satisfeitos na última execução, com todos os testes aprovados. Os casos CT15 a CT20 foram executados em 10 de outubro de 2026, na caixa atual (Quadro 4), com a arquitetura de 3.5.2 e o firmware correspondente gravado no nó, ligado ao ambiente implantado e calibrado no início da sessão (3.4.4); o registro de cada caso está no repositório (Apêndice B). Os seis foram satisfeitos. No CT15, a iluminância medida ficou 0,7 % acima do valor esperado </w:t>
+      </w:r>
+      <w:r>
+        <w:rPr>
+          <w:highlight w:val="yellow"/>
+          <w:lang w:val="pt-BR"/>
+        </w:rPr>
+        <w:lastRenderedPageBreak/>
+        <w:t>para o nível aplicado, dentro da tolerância de 3,4 %. No CT16, o alerta de falha total foi aberto após três leituras com a fonte da fita desligada e encerrado ao religá-la. No CT17, as trinta repetições ficaram abaixo de 1,5 s, contra o limite de 180 s. No CT18, o nó assumiu o nível pleno no instante em que venceu a validade do último comando, e o sensor registrou o pleno 2,3 s depois. No CT19, a conexão ao intermediário foi recusada sem credencial e com senha incorreta, e aceita com a credencial do nó, sobre canal TLS 1.3. No CT20, um segundo ponto de luz foi comandado sem alteração nem reinício do serviço de decisão, por meio do nó simulado, cuja iluminância é sintética. Uma sessão anterior, de 4 e 5 de outubro, na primeira caixa e com o failsafe de 15 s sem comando, está registrada no repositório e não compõe estes resultados; nela, o CT18 não foi satisfeito nos termos então fixados, porque o sensor registrou o pleno 17,3 s após o último comando, contra o limite de 15 s.</w:t>
       </w:r>
     </w:p>
     <w:p>
@@ -29068,14 +28982,7 @@
           <w:highlight w:val="yellow"/>
           <w:lang w:val="pt-BR"/>
         </w:rPr>
-        <w:t xml:space="preserve">Depois da sessão, a telemetria passou a levar também o estado do nó no instante em que o comando chega, antes de aplicá-lo (3.13.2), e a mudança foi verificada no mesmo dia, com o mesmo nó, depois de nova conferência e recalibração (sessão 115), exigidas porque a caixa havia sido deslocada. Publicado volume nulo nos três trechos do ponto, a decisão emitiu 0,625: o ensaio foi feito à tarde, quando o relógio do serviço trata o horário como início da noite, e a regra desse horário, que pede uma classe abaixo, ativou junto com a de movimentação baixa, o que resultou no degrau 1,5. Concluída a rampa, uma ocorrência de segurança levou o nível ao pleno, e a telemetria dessa decisão registrou o nível 1,000 e 9,96 lux, junto do estado </w:t>
-      </w:r>
-      <w:r>
-        <w:rPr>
-          <w:highlight w:val="yellow"/>
-          <w:lang w:val="pt-BR"/>
-        </w:rPr>
-        <w:t>anterior, de 0,625 e 6,23 lux, 0,3 % abaixo do esperado: o ponto em que a rampa terminou, que antes só ficava na saída serial do nó, ficou registrado no banco.</w:t>
+        <w:t>Depois da sessão, a telemetria passou a levar também o estado do nó no instante em que o comando chega, antes de aplicá-lo (3.13.2), e a mudança foi verificada no mesmo dia, com o mesmo nó, depois de nova conferência e recalibração (sessão 115), exigidas porque a caixa havia sido deslocada. Publicado volume nulo nos três trechos do ponto, a decisão emitiu 0,625: o ensaio foi feito à tarde, quando o relógio do serviço trata o horário como início da noite, e a regra desse horário, que pede uma classe abaixo, ativou junto com a de movimentação baixa, o que resultou no degrau 1,5. Concluída a rampa, uma ocorrência de segurança levou o nível ao pleno, e a telemetria dessa decisão registrou o nível 1,000 e 9,96 lux, junto do estado anterior, de 0,625 e 6,23 lux, 0,3 % abaixo do esperado: o ponto em que a rampa terminou, que antes só ficava na saída serial do nó, ficou registrado no banco.</w:t>
       </w:r>
     </w:p>
     <w:p>
@@ -29141,6 +29048,7 @@
         <w:rPr>
           <w:lang w:val="pt-BR"/>
         </w:rPr>
+        <w:lastRenderedPageBreak/>
         <w:t>Adota-se modelo relacional, e a escolha decorre da natureza dos dados. O critério normativo aplicável a uma decisão depende da classe de iluminação da via em que o ponto de luz se encontra; reconstruir, para qualquer decisão passada, qual piso vigorava é uma operação de junção entre entidades, e não de varredura de documentos. A integridade referencial é, neste caso, o próprio mecanismo de auditoria: uma decisão que não se ligue a um ponto de luz, a uma classe e a uma versão da base de regras é registro sem sentido, e o modelo relacional o impede por construção. O volume envolvido na avaliação em bancada é pequeno, e nenhuma característica de escala justificaria abrir mão dessa garantia.</w:t>
       </w:r>
     </w:p>
@@ -29581,6 +29489,7 @@
                 <w:sz w:val="20"/>
                 <w:szCs w:val="20"/>
               </w:rPr>
+              <w:lastRenderedPageBreak/>
               <w:t>trecho_ponto</w:t>
             </w:r>
             <w:proofErr w:type="spellEnd"/>
@@ -30413,6 +30322,7 @@
           <w:szCs w:val="20"/>
           <w:lang w:val="pt-BR"/>
         </w:rPr>
+        <w:lastRenderedPageBreak/>
         <w:t>Fonte: Elaborado pelos autores (2026).</w:t>
       </w:r>
     </w:p>
@@ -30478,19 +30388,7 @@
         <w:rPr>
           <w:lang w:val="pt-BR"/>
         </w:rPr>
-        <w:t xml:space="preserve">A </w:t>
-      </w:r>
-      <w:r>
-        <w:rPr>
-          <w:lang w:val="pt-BR"/>
-        </w:rPr>
-        <w:t xml:space="preserve">Figura 10</w:t>
-      </w:r>
-      <w:r>
-        <w:rPr>
-          <w:lang w:val="pt-BR"/>
-        </w:rPr>
-        <w:t xml:space="preserve"> apresenta o modelo de dados em nível de relacionamento. A justificativa da escolha pelo modelo relacional e a função de cada entidade estão registradas em 3.13.1 e no Quadro 16; o que a figura acrescenta são as cardinalidades e uma entidade que aquele quadro não discrimina.</w:t>
+        <w:t>A Figura 10 apresenta o modelo de dados em nível de relacionamento. A justificativa da escolha pelo modelo relacional e a função de cada entidade estão registradas em 3.13.1 e no Quadro 16; o que a figura acrescenta são as cardinalidades e uma entidade que aquele quadro não discrimina.</w:t>
       </w:r>
     </w:p>
     <w:p>
@@ -30508,15 +30406,8 @@
           <w:szCs w:val="20"/>
           <w:lang w:val="pt-BR"/>
         </w:rPr>
-        <w:t xml:space="preserve">Figura 10</w:t>
-      </w:r>
-      <w:r>
-        <w:rPr>
-          <w:sz w:val="20"/>
-          <w:szCs w:val="20"/>
-          <w:lang w:val="pt-BR"/>
-        </w:rPr>
-        <w:t xml:space="preserve"> – Diagrama entidade-relacionamento do banco de dados</w:t>
+        <w:lastRenderedPageBreak/>
+        <w:t>Figura 10 – Diagrama entidade-relacionamento do banco de dados</w:t>
       </w:r>
     </w:p>
     <w:p>
@@ -30549,7 +30440,7 @@
                     <pic:cNvPicPr/>
                   </pic:nvPicPr>
                   <pic:blipFill>
-                    <a:blip r:embed="rId14"/>
+                    <a:blip r:embed="rId17"/>
                     <a:stretch>
                       <a:fillRect/>
                     </a:stretch>
@@ -30622,6 +30513,7 @@
         <w:rPr>
           <w:lang w:val="pt-BR"/>
         </w:rPr>
+        <w:lastRenderedPageBreak/>
         <w:t>decisão e não são registradas nessa entidade. Como a leitura é feita logo depois de aplicado o comando, a telemetria registra também o estado do nó no instante em que o comando chegou: é por ela que o ponto em que terminou a rampa anterior — o piso, por exemplo — fica no banco, ainda que só com o comando seguinte. A relação entre classe de iluminação e ponto de luz, por sua vez, é o que permite recuperar por junção o critério normativo aplicável a qualquer decisão passada, mesmo após reclassificação da via — desde que a reclassificação seja registrada como dado novo, e não como alteração do registro existente. Para que a garantia não dependa dessa disciplina, a decisão carrega também a classe vigente no momento em que foi tomada: a junção com a classe serve para recuperar os limites daquela classe, e não para descobrir qual classe valia.</w:t>
       </w:r>
     </w:p>
@@ -30669,7 +30561,6 @@
       </w:pPr>
       <w:r>
         <w:rPr>
-          <w:highlight w:val="yellow"/>
           <w:lang w:val="pt-BR"/>
         </w:rPr>
         <w:t>O Quadro 17 detalha as tabelas do esquema implementado em PostgreSQL. Níveis de iluminação são decimais de três casas entre 0 e 1; iluminâncias, decimais em lux; instantes, carimbos de tempo com fuso horário; e os vocabulários fechados são restrições de verificação do próprio banco.</w:t>
@@ -30972,6 +30863,7 @@
                 <w:szCs w:val="20"/>
                 <w:lang w:val="pt-BR"/>
               </w:rPr>
+              <w:lastRenderedPageBreak/>
               <w:t>operacional em {operante, falha, manutenção, sem comunicação}; potência plena do segmento, positiva</w:t>
             </w:r>
           </w:p>
@@ -30998,6 +30890,7 @@
                 <w:szCs w:val="20"/>
                 <w:lang w:val="pt-BR"/>
               </w:rPr>
+              <w:lastRenderedPageBreak/>
               <w:t>Ponto comandado; o estado é atualizado pela presença do nó e pelo diagnóstico</w:t>
             </w:r>
           </w:p>
@@ -31553,6 +31446,7 @@
                 <w:sz w:val="20"/>
                 <w:szCs w:val="20"/>
               </w:rPr>
+              <w:lastRenderedPageBreak/>
               <w:t>decisao</w:t>
             </w:r>
             <w:proofErr w:type="spellEnd"/>
@@ -32048,6 +31942,7 @@
         <w:rPr>
           <w:lang w:val="pt-BR"/>
         </w:rPr>
+        <w:lastRenderedPageBreak/>
         <w:t>4 RESULTADOS</w:t>
       </w:r>
       <w:bookmarkEnd w:id="60"/>
@@ -32134,6 +32029,7 @@
           <w:highlight w:val="yellow"/>
           <w:lang w:val="pt-BR"/>
         </w:rPr>
+        <w:lastRenderedPageBreak/>
         <w:t>Com a série horária de Melbourne, empregada antes da troca (3.6), o modelo havia apresentado erro absoluto médio de 0,047, contra 0,057 da média sazonal, e era equivalente à floresta aleatória, com diferença de 0,5 %. O experimento que motivou a troca, com 14 pontos de Zurique, 12 deles com dados no ano de teste, está no Tabela 4, em 4.6: na resolução de 15 min, o modelo supera a melhor referência simples pelas margens fixadas; com os mesmos dados somados por hora, não.</w:t>
       </w:r>
     </w:p>
@@ -32219,6 +32115,7 @@
           <w:highlight w:val="yellow"/>
           <w:lang w:val="pt-BR"/>
         </w:rPr>
+        <w:lastRenderedPageBreak/>
         <w:t>A medição exigiu duas execuções, ambas registradas. Na primeira, a ocorrência curta publicada antes das repetições para medir a diferença entre os relógios venceu pelo prazo e, sem evento que o reconhecesse, manteve o alvo no pleno; a primeira repetição não mudou o alvo nem gerou comando, e a execução foi interrompida. É a limitação declarada em 5.3 para a ocorrência encerrada por prazo, e o procedimento passou a publicar o encerramento explícito. A diferença entre os relógios, de 1,3 s, foi corrigida nos instantes publicados: o serviço desconsidera publicação com instante posterior ao do seu relógio, e a resposta imediata pressupõe relógios sincronizados entre a plataforma e o serviço.</w:t>
       </w:r>
     </w:p>
@@ -32292,6 +32189,7 @@
         <w:rPr>
           <w:lang w:val="pt-BR"/>
         </w:rPr>
+        <w:lastRenderedPageBreak/>
         <w:t>iluminação pudesse consumi-la, onde, quando e como, com a justificativa de cada requisito.</w:t>
       </w:r>
     </w:p>
@@ -33210,6 +33108,7 @@
                 <w:sz w:val="20"/>
                 <w:szCs w:val="20"/>
               </w:rPr>
+              <w:lastRenderedPageBreak/>
               <w:t>Madrugada</w:t>
             </w:r>
             <w:proofErr w:type="spellEnd"/>
@@ -34008,6 +33907,7 @@
           <w:highlight w:val="yellow"/>
           <w:lang w:val="pt-BR"/>
         </w:rPr>
+        <w:lastRenderedPageBreak/>
         <w:t>regime. Os valores decorrem do registro de decisões, pela fórmula de 3.11, e não constituem medição elétrica.</w:t>
       </w:r>
     </w:p>
@@ -34751,6 +34651,7 @@
         <w:rPr>
           <w:lang w:val="pt-BR"/>
         </w:rPr>
+        <w:lastRenderedPageBreak/>
         <w:t>taxa foi zero. O Tabela 3 reúne o que se mediu ao retirar ou substituir cada componente no sistema; onde há dois valores, o primeiro é o do componente e o segundo, o da alternativa.</w:t>
       </w:r>
     </w:p>
@@ -35456,6 +35357,7 @@
                 <w:szCs w:val="20"/>
                 <w:lang w:val="pt-BR"/>
               </w:rPr>
+              <w:lastRenderedPageBreak/>
               <w:t>Inferência nebulosa × tabela em degraus × tabela com histerese de descida</w:t>
             </w:r>
           </w:p>
@@ -35795,6 +35697,7 @@
                 <w:sz w:val="20"/>
                 <w:szCs w:val="20"/>
               </w:rPr>
+              <w:lastRenderedPageBreak/>
               <w:t>Acerto</w:t>
             </w:r>
             <w:proofErr w:type="spellEnd"/>
@@ -36166,6 +36069,7 @@
         <w:rPr>
           <w:lang w:val="pt-BR"/>
         </w:rPr>
+        <w:lastRenderedPageBreak/>
         <w:t>5 ANÁLISE DOS RESULTADOS</w:t>
       </w:r>
       <w:bookmarkEnd w:id="67"/>
@@ -36345,6 +36249,7 @@
         <w:rPr>
           <w:lang w:val="pt-BR"/>
         </w:rPr>
+        <w:lastRenderedPageBreak/>
         <w:t>O protótipo é um nó único, em escala reduzida e em baixa tensão de corrente contínua, não reproduzindo a potência, a altura de montagem nem a geometria fotométrica de uma luminária viária real. O que se transpõe é a arquitetura e o procedimento, não os valores medidos.</w:t>
       </w:r>
     </w:p>
@@ -36451,6 +36356,7 @@
         <w:rPr>
           <w:lang w:val="pt-BR"/>
         </w:rPr>
+        <w:lastRenderedPageBreak/>
         <w:t>Os sensores da bancada não têm calibração rastreável a padrão metrológico e a cadeia de medição é única, sem verificação cruzada contra instrumento de referência. O trabalho afirma repetibilidade, monotonicidade e consistência interna da escala, e não exatidão absoluta em iluminância, nos termos de 3.4.4.</w:t>
       </w:r>
     </w:p>
@@ -36557,6 +36463,7 @@
         <w:rPr>
           <w:lang w:val="pt-BR"/>
         </w:rPr>
+        <w:lastRenderedPageBreak/>
         <w:t>registrada, supõe proporcionalidade entre ciclo e potência e despreza a eficiência variável do regulador de corrente e o consumo fixo do módulo de telegestão — hipóteses que a tornam um limite superior otimista quando transposta a equipamento viário, nos termos de 3.11. A projeção para o parque adota luminária de referência derivada dos parâmetros contratuais, e não modelo comercial identificado, informação que não é divulgada. Não se afirma economia anual, em escala de parque, nem valor monetário. A quantificação com medição elétrica rastreável figura entre as recomendações de 6.1.</w:t>
       </w:r>
     </w:p>
@@ -36683,6 +36590,7 @@
         <w:rPr>
           <w:lang w:val="pt-BR"/>
         </w:rPr>
+        <w:lastRenderedPageBreak/>
         <w:t>ele; o tratamento desses casos figura na especificação de integração como requisito à plataforma, e não como resultado medido.</w:t>
       </w:r>
     </w:p>
@@ -36843,6 +36751,7 @@
         <w:rPr>
           <w:lang w:val="pt-BR"/>
         </w:rPr>
+        <w:lastRenderedPageBreak/>
         <w:t>Não houve teste de carga na escala do parque: a estimativa de cerca de 170 publicações por segundo para 50 mil câmeras é cálculo, e não medição.</w:t>
       </w:r>
     </w:p>
@@ -36943,6 +36852,7 @@
         <w:rPr>
           <w:lang w:val="pt-BR"/>
         </w:rPr>
+        <w:lastRenderedPageBreak/>
         <w:t>A avaliação dos componentes apoia-se em oito noites reais de uma série de 15 min, em que o volume de 5 min repete o valor do bloco, e em pares sintéticos de falha de contagem. O déficit em relação ao nível pedido adota o critério dos tercis, que é dos autores. Uma série de contagem por minuto, que permitiria avaliar o período de 5 min da interface, está sendo reunida a partir da publicação diária de Melbourne, e não compõe os resultados desta versão.</w:t>
       </w:r>
     </w:p>
@@ -37034,6 +36944,7 @@
         <w:rPr>
           <w:lang w:val="pt-BR"/>
         </w:rPr>
+        <w:lastRenderedPageBreak/>
         <w:t>6 CONCLUSÕES</w:t>
       </w:r>
       <w:bookmarkEnd w:id="72"/>
@@ -37265,6 +37176,7 @@
         <w:rPr>
           <w:lang w:val="pt-BR"/>
         </w:rPr>
+        <w:lastRenderedPageBreak/>
         <w:t>Treinar e operar a camada de previsão com série no período de publicação da interface, de 5 min, e avaliar o efeito no ciclo completo de decisão (3.6, 4.6 e 5.3).</w:t>
       </w:r>
     </w:p>
@@ -37343,6 +37255,7 @@
         <w:rPr>
           <w:lang w:val="pt-BR"/>
         </w:rPr>
+        <w:lastRenderedPageBreak/>
         <w:t>REFERÊNCIAS</w:t>
       </w:r>
       <w:bookmarkEnd w:id="74"/>
@@ -37637,6 +37550,7 @@
         <w:rPr>
           <w:lang w:val="pt-BR"/>
         </w:rPr>
+        <w:lastRenderedPageBreak/>
         <w:t>https://www.planalto.gov.br/ccivil_03/_ato2015-2018/2018/lei/l13709.htm. Acesso em: 13 set. 2026.</w:t>
       </w:r>
     </w:p>
@@ -37951,6 +37865,7 @@
         <w:rPr>
           <w:lang w:val="pt-BR"/>
         </w:rPr>
+        <w:lastRenderedPageBreak/>
         <w:t xml:space="preserve">INSTITUTO NACIONAL DE METROLOGIA, QUALIDADE E TECNOLOGIA. </w:t>
       </w:r>
       <w:r>
@@ -38194,6 +38109,7 @@
         <w:spacing w:after="240"/>
       </w:pPr>
       <w:r>
+        <w:lastRenderedPageBreak/>
         <w:t xml:space="preserve">PERRY, Tekla S. Cops tap smart streetlights, sparking controversy and legislation. </w:t>
       </w:r>
       <w:r>
@@ -38462,6 +38378,7 @@
         <w:rPr>
           <w:lang w:val="pt-BR"/>
         </w:rPr>
+        <w:lastRenderedPageBreak/>
         <w:t>Paulo: Prefeitura do Município de São Paulo, 8 out. 2021. Disponível em: https://prefeitura.sp.gov.br/w/noticia/prefeitura-avanca-na-modernizacao-com-led-da-rede-de-iluminacao-publica-de-sao-paulo. Acesso em: 13 set. 2026.</w:t>
       </w:r>
     </w:p>
@@ -38643,6 +38560,7 @@
         <w:spacing w:after="240"/>
       </w:pPr>
       <w:r>
+        <w:lastRenderedPageBreak/>
         <w:t>SHIKAKURA, Tomoaki; MORIKAWA, Hiroyuki; NAKAMURA, Yoshiki. Perception of lighting fluctuation in office lighting environment. Journal of Light &amp; Visual Environment, v. 27, n. 2, p. 75-82, 2003. DOI: 10.2150/jlve.27.75.</w:t>
       </w:r>
     </w:p>
@@ -38799,6 +38717,7 @@
         <w:rPr>
           <w:lang w:val="pt-BR"/>
         </w:rPr>
+        <w:lastRenderedPageBreak/>
         <w:t>APÊNDICE A — DECLARAÇÃO DE USO DE FERRAMENTAS DE INTELIGÊNCIA ARTIFICIAL GENERATIVA</w:t>
       </w:r>
       <w:bookmarkEnd w:id="75"/>
@@ -39005,6 +38924,7 @@
           <w:szCs w:val="20"/>
           <w:lang w:val="pt-BR"/>
         </w:rPr>
+        <w:lastRenderedPageBreak/>
         <w:t>Quadro 19 – Matriz de emprego técnico de inteligência artificial</w:t>
       </w:r>
     </w:p>
@@ -39455,7 +39375,7 @@
                 <w:sz w:val="20"/>
                 <w:szCs w:val="20"/>
               </w:rPr>
-              <w:t xml:space="preserve">Figuras 3, 4, 5 e 10</w:t>
+              <w:t>Figuras 3, 4, 5 e 10</w:t>
             </w:r>
           </w:p>
         </w:tc>
@@ -40099,6 +40019,7 @@
                 <w:szCs w:val="20"/>
                 <w:lang w:val="pt-BR"/>
               </w:rPr>
+              <w:lastRenderedPageBreak/>
               <w:t>aprovados pelos autores antes de cada execução; busca e conferência de qualidade dos conjuntos de dados públicos</w:t>
             </w:r>
           </w:p>
@@ -40119,6 +40040,7 @@
                 <w:sz w:val="20"/>
                 <w:szCs w:val="20"/>
               </w:rPr>
+              <w:lastRenderedPageBreak/>
               <w:t>40</w:t>
             </w:r>
           </w:p>
@@ -40266,6 +40188,7 @@
         <w:rPr>
           <w:lang w:val="pt-BR"/>
         </w:rPr>
+        <w:lastRenderedPageBreak/>
         <w:t>2. O corpo teórico, a análise crítica, a inferência empírica e as conclusões apresentadas representam o esforço intelectual dos autores humanos, a quem cabe a decisão sobre cada afirmação sustentada no texto.</w:t>
       </w:r>
     </w:p>
@@ -40479,6 +40402,7 @@
         <w:rPr>
           <w:lang w:val="pt-BR"/>
         </w:rPr>
+        <w:lastRenderedPageBreak/>
         <w:t>APÊNDICE B — REPRODUTIBILIDADE DOS RESULTADOS</w:t>
       </w:r>
       <w:bookmarkEnd w:id="76"/>
@@ -40796,6 +40720,7 @@
                 <w:szCs w:val="20"/>
                 <w:lang w:val="pt-BR"/>
               </w:rPr>
+              <w:lastRenderedPageBreak/>
               <w:t>modelo/treinar.py; série de Melbourne extraída em 23/09/2026</w:t>
             </w:r>
           </w:p>
@@ -40822,6 +40747,7 @@
                 <w:szCs w:val="20"/>
                 <w:lang w:val="pt-BR"/>
               </w:rPr>
+              <w:lastRenderedPageBreak/>
               <w:t>python -m modelo.comparar_modelos. Resultado em modelo/resultados/comparacao_modelos.json. Protocolo f6d306c; resultado 7ad1b3c</w:t>
             </w:r>
           </w:p>
@@ -41550,6 +41476,7 @@
                 <w:szCs w:val="20"/>
                 <w:lang w:val="pt-BR"/>
               </w:rPr>
+              <w:lastRenderedPageBreak/>
               <w:t>bancada e simulado ligados ao ambiente implantado</w:t>
             </w:r>
           </w:p>
@@ -41571,6 +41498,7 @@
                 <w:szCs w:val="20"/>
                 <w:lang w:val="pt-BR"/>
               </w:rPr>
+              <w:lastRenderedPageBreak/>
               <w:t xml:space="preserve">python -m bancada.sessao_ct latencia, piso e credencial; CT16 com comandos provocados e python -m bancada.sessao_ct </w:t>
             </w:r>
             <w:r>
@@ -41579,6 +41507,7 @@
                 <w:szCs w:val="20"/>
                 <w:lang w:val="pt-BR"/>
               </w:rPr>
+              <w:lastRenderedPageBreak/>
               <w:t>alertas; CT18 com o registro da porta serial. Registros em bancada/resultados/ct*_20261010*. Versões 1d7b3f7 e 396076b</w:t>
             </w:r>
           </w:p>
@@ -41607,6 +41536,7 @@
                 <w:szCs w:val="20"/>
                 <w:lang w:val="pt-BR"/>
               </w:rPr>
+              <w:lastRenderedPageBreak/>
               <w:t>4.5 — energia do nó de bancada</w:t>
             </w:r>
           </w:p>
@@ -41782,6 +41712,7 @@
         <w:rPr>
           <w:lang w:val="pt-BR"/>
         </w:rPr>
+        <w:lastRenderedPageBreak/>
         <w:t>APÊNDICE C — REGISTRO FOTOGRÁFICO DO NÓ DE BANCADA</w:t>
       </w:r>
     </w:p>
@@ -41798,19 +41729,7 @@
         <w:rPr>
           <w:lang w:val="pt-BR"/>
         </w:rPr>
-        <w:t xml:space="preserve">A </w:t>
-      </w:r>
-      <w:r>
-        <w:rPr>
-          <w:lang w:val="pt-BR"/>
-        </w:rPr>
-        <w:t xml:space="preserve">Figura 11</w:t>
-      </w:r>
-      <w:r>
-        <w:rPr>
-          <w:lang w:val="pt-BR"/>
-        </w:rPr>
-        <w:t xml:space="preserve"> complementa as Figuras 1 e 2 com a vista posterior do nó de demonstração, em que aparecem a passagem do cabo de alimentação da fita pela parede do anteparo e a posição do sensor na face oposta.</w:t>
+        <w:t>A Figura 11 complementa as Figuras 1 e 2 com a vista posterior do nó de demonstração, em que aparecem a passagem do cabo de alimentação da fita pela parede do anteparo e a posição do sensor na face oposta.</w:t>
       </w:r>
     </w:p>
     <w:p>
@@ -41828,15 +41747,7 @@
           <w:szCs w:val="20"/>
           <w:lang w:val="pt-BR"/>
         </w:rPr>
-        <w:t xml:space="preserve">Figura 11</w:t>
-      </w:r>
-      <w:r>
-        <w:rPr>
-          <w:sz w:val="20"/>
-          <w:szCs w:val="20"/>
-          <w:lang w:val="pt-BR"/>
-        </w:rPr>
-        <w:t xml:space="preserve"> – Vista posterior do nó de demonstração</w:t>
+        <w:t>Figura 11 – Vista posterior do nó de demonstração</w:t>
       </w:r>
     </w:p>
     <w:p>
@@ -41868,7 +41779,7 @@
                     <pic:cNvPicPr/>
                   </pic:nvPicPr>
                   <pic:blipFill>
-                    <a:blip r:embed="rId15"/>
+                    <a:blip r:embed="rId18"/>
                     <a:stretch>
                       <a:fillRect/>
                     </a:stretch>
@@ -41904,7 +41815,7 @@
       </w:r>
     </w:p>
     <w:sectPr>
-      <w:headerReference w:type="default" r:id="rId16"/>
+      <w:headerReference w:type="default" r:id="rId19"/>
       <w:pgSz w:w="11906" w:h="16838"/>
       <w:pgMar w:top="1701" w:right="1134" w:bottom="1134" w:left="1701" w:header="1134" w:footer="708" w:gutter="0"/>
       <w:pgNumType w:start="9"/>

</xml_diff>